<commit_message>
css + filter + rendeleés
</commit_message>
<xml_diff>
--- a/backend/Projekt feladat.docx
+++ b/backend/Projekt feladat.docx
@@ -166,12 +166,7 @@
         <w:t xml:space="preserve">Illusztrátor: Ki(k) </w:t>
       </w:r>
       <w:r>
-        <w:t>a könyv illusztrátor</w:t>
-      </w:r>
-      <w:bookmarkStart w:id="0" w:name="_GoBack"/>
-      <w:bookmarkEnd w:id="0"/>
-      <w:r>
-        <w:t>ai</w:t>
+        <w:t>a könyv illusztrátorai</w:t>
       </w:r>
       <w:r>
         <w:t xml:space="preserve"> (VARCHAR(150)), egyedi azonosítóval (INT).</w:t>
@@ -330,6 +325,35 @@
         </w:rPr>
       </w:pPr>
       <w:r>
+        <w:t xml:space="preserve">Fizetési mód: Milyen módokon lehet fizetni. (VARCHAR(150)), Egyedi azonosítója az </w:t>
+      </w:r>
+      <w:proofErr w:type="spellStart"/>
+      <w:r>
+        <w:t>id</w:t>
+      </w:r>
+      <w:proofErr w:type="spellEnd"/>
+      <w:r>
+        <w:t xml:space="preserve"> (INT).</w:t>
+      </w:r>
+      <w:r>
+        <w:rPr>
+          <w:noProof/>
+        </w:rPr>
+        <w:t xml:space="preserve"> </w:t>
+      </w:r>
+    </w:p>
+    <w:p>
+      <w:pPr>
+        <w:pStyle w:val="Listaszerbekezds"/>
+        <w:numPr>
+          <w:ilvl w:val="0"/>
+          <w:numId w:val="1"/>
+        </w:numPr>
+        <w:rPr>
+          <w:noProof/>
+        </w:rPr>
+      </w:pPr>
+      <w:r>
         <w:rPr>
           <w:noProof/>
         </w:rPr>
@@ -337,10 +361,10 @@
           <wp:anchor distT="0" distB="0" distL="114300" distR="114300" simplePos="0" relativeHeight="251658240" behindDoc="1" locked="0" layoutInCell="1" allowOverlap="1" wp14:anchorId="1E0FCE13">
             <wp:simplePos x="0" y="0"/>
             <wp:positionH relativeFrom="column">
-              <wp:posOffset>3138805</wp:posOffset>
+              <wp:posOffset>3202416</wp:posOffset>
             </wp:positionH>
             <wp:positionV relativeFrom="paragraph">
-              <wp:posOffset>136525</wp:posOffset>
+              <wp:posOffset>207479</wp:posOffset>
             </wp:positionV>
             <wp:extent cx="2695575" cy="3620625"/>
             <wp:effectExtent l="0" t="0" r="0" b="0"/>
@@ -393,14 +417,34 @@
         <w:rPr>
           <w:noProof/>
         </w:rPr>
+        <w:t xml:space="preserve">Szállítás: Milyen szállítási módok vehetők igénybe (VARCHAR(150)), Egyedi azonosítója az id (INT) </w:t>
+      </w:r>
+    </w:p>
+    <w:p>
+      <w:pPr>
+        <w:rPr>
+          <w:noProof/>
+        </w:rPr>
+      </w:pPr>
+    </w:p>
+    <w:p>
+      <w:pPr>
+        <w:rPr>
+          <w:noProof/>
+        </w:rPr>
+      </w:pPr>
+      <w:r>
+        <w:rPr>
+          <w:noProof/>
+        </w:rPr>
         <w:drawing>
           <wp:anchor distT="0" distB="0" distL="114300" distR="114300" simplePos="0" relativeHeight="251659264" behindDoc="1" locked="0" layoutInCell="1" allowOverlap="1" wp14:anchorId="02DEFDFA">
             <wp:simplePos x="0" y="0"/>
-            <wp:positionH relativeFrom="column">
-              <wp:posOffset>43815</wp:posOffset>
+            <wp:positionH relativeFrom="margin">
+              <wp:posOffset>110546</wp:posOffset>
             </wp:positionH>
             <wp:positionV relativeFrom="paragraph">
-              <wp:posOffset>654685</wp:posOffset>
+              <wp:posOffset>33765</wp:posOffset>
             </wp:positionV>
             <wp:extent cx="3114205" cy="2488412"/>
             <wp:effectExtent l="0" t="0" r="0" b="7620"/>
@@ -449,56 +493,6 @@
           </wp:anchor>
         </w:drawing>
       </w:r>
-      <w:r>
-        <w:t xml:space="preserve">Fizetési mód: Milyen módokon </w:t>
-      </w:r>
-      <w:proofErr w:type="spellStart"/>
-      <w:r>
-        <w:t>leh</w:t>
-      </w:r>
-      <w:proofErr w:type="spellEnd"/>
-      <w:r>
-        <w:rPr>
-          <w:noProof/>
-        </w:rPr>
-        <w:t xml:space="preserve"> </w:t>
-      </w:r>
-      <w:proofErr w:type="spellStart"/>
-      <w:r>
-        <w:t>et</w:t>
-      </w:r>
-      <w:proofErr w:type="spellEnd"/>
-      <w:r>
-        <w:t xml:space="preserve"> fizetni. (VARCHAR(150)), Egyedi azonosítója az </w:t>
-      </w:r>
-      <w:proofErr w:type="spellStart"/>
-      <w:r>
-        <w:t>id</w:t>
-      </w:r>
-      <w:proofErr w:type="spellEnd"/>
-      <w:r>
-        <w:t xml:space="preserve"> (INT).</w:t>
-      </w:r>
-      <w:r>
-        <w:rPr>
-          <w:noProof/>
-        </w:rPr>
-        <w:t xml:space="preserve"> </w:t>
-      </w:r>
-    </w:p>
-    <w:p>
-      <w:pPr>
-        <w:rPr>
-          <w:noProof/>
-        </w:rPr>
-      </w:pPr>
-    </w:p>
-    <w:p>
-      <w:pPr>
-        <w:rPr>
-          <w:noProof/>
-        </w:rPr>
-      </w:pPr>
       <w:r>
         <w:rPr>
           <w:noProof/>
@@ -565,7 +559,13 @@
                         <w:txbxContent>
                           <w:p>
                             <w:r>
-                              <w:t xml:space="preserve">Az oldal végpontjai a következők: </w:t>
+                              <w:t>Az oldal</w:t>
+                            </w:r>
+                            <w:r>
+                              <w:t xml:space="preserve"> a felhasználó által használható</w:t>
+                            </w:r>
+                            <w:r>
+                              <w:t xml:space="preserve"> végpontjai a következők: </w:t>
                             </w:r>
                           </w:p>
                           <w:p>
@@ -637,20 +637,11 @@
                             </w:r>
                             <w:proofErr w:type="spellStart"/>
                             <w:r>
-                              <w:t>search?</w:t>
-                            </w:r>
-                            <w:r>
-                              <w:t>illusz</w:t>
+                              <w:t>search?illusz</w:t>
                             </w:r>
                             <w:proofErr w:type="spellEnd"/>
                             <w:r>
-                              <w:t>=’’ : A</w:t>
-                            </w:r>
-                            <w:r>
-                              <w:t>z illusztrátorok</w:t>
-                            </w:r>
-                            <w:r>
-                              <w:t xml:space="preserve"> neve alapján szűr. </w:t>
+                              <w:t xml:space="preserve">=’’ : Az illusztrátorok neve alapján szűr. </w:t>
                             </w:r>
                           </w:p>
                           <w:p>
@@ -674,20 +665,11 @@
                             </w:r>
                             <w:proofErr w:type="spellStart"/>
                             <w:r>
-                              <w:t>search?</w:t>
-                            </w:r>
-                            <w:r>
-                              <w:t>nyelv</w:t>
+                              <w:t>search?nyelv</w:t>
                             </w:r>
                             <w:proofErr w:type="spellEnd"/>
                             <w:r>
-                              <w:t xml:space="preserve">=’’ : A </w:t>
-                            </w:r>
-                            <w:r>
-                              <w:t xml:space="preserve">nyelv </w:t>
-                            </w:r>
-                            <w:r>
-                              <w:t xml:space="preserve">alapján szűr. </w:t>
+                              <w:t xml:space="preserve">=’’ : A nyelv alapján szűr. </w:t>
                             </w:r>
                           </w:p>
                           <w:p>
@@ -711,20 +693,11 @@
                             </w:r>
                             <w:proofErr w:type="spellStart"/>
                             <w:r>
-                              <w:t>search?</w:t>
-                            </w:r>
-                            <w:r>
-                              <w:t>kat</w:t>
+                              <w:t>search?kat</w:t>
                             </w:r>
                             <w:proofErr w:type="spellEnd"/>
                             <w:r>
-                              <w:t xml:space="preserve">=’’ : A </w:t>
-                            </w:r>
-                            <w:r>
-                              <w:t>kategóriák</w:t>
-                            </w:r>
-                            <w:r>
-                              <w:t xml:space="preserve"> alapján szűr. </w:t>
+                              <w:t xml:space="preserve">=’’ : A kategóriák alapján szűr. </w:t>
                             </w:r>
                           </w:p>
                           <w:p>
@@ -748,20 +721,11 @@
                             </w:r>
                             <w:proofErr w:type="spellStart"/>
                             <w:r>
-                              <w:t>search?</w:t>
-                            </w:r>
-                            <w:r>
-                              <w:t>kiado</w:t>
+                              <w:t>search?kiado</w:t>
                             </w:r>
                             <w:proofErr w:type="spellEnd"/>
                             <w:r>
-                              <w:t xml:space="preserve">=’’ : A </w:t>
-                            </w:r>
-                            <w:r>
-                              <w:t>kiadó</w:t>
-                            </w:r>
-                            <w:r>
-                              <w:t xml:space="preserve"> alapján szűr. </w:t>
+                              <w:t xml:space="preserve">=’’ : A kiadó alapján szűr. </w:t>
                             </w:r>
                           </w:p>
                           <w:p>
@@ -785,20 +749,31 @@
                             </w:r>
                             <w:proofErr w:type="spellStart"/>
                             <w:r>
-                              <w:t>search?</w:t>
-                            </w:r>
-                            <w:r>
-                              <w:t>cim</w:t>
+                              <w:t>search?cim</w:t>
                             </w:r>
                             <w:proofErr w:type="spellEnd"/>
                             <w:r>
-                              <w:t xml:space="preserve">=’’ : A </w:t>
-                            </w:r>
-                            <w:r>
-                              <w:t>cím</w:t>
-                            </w:r>
-                            <w:r>
-                              <w:t xml:space="preserve"> alapján szűr. </w:t>
+                              <w:t xml:space="preserve">=’’ : A cím alapján szűr. </w:t>
+                            </w:r>
+                          </w:p>
+                          <w:p>
+                            <w:pPr>
+                              <w:pStyle w:val="Listaszerbekezds"/>
+                              <w:numPr>
+                                <w:ilvl w:val="0"/>
+                                <w:numId w:val="2"/>
+                              </w:numPr>
+                            </w:pPr>
+                            <w:r>
+                              <w:t>/</w:t>
+                            </w:r>
+                            <w:proofErr w:type="spellStart"/>
+                            <w:r>
+                              <w:t>konyvek</w:t>
+                            </w:r>
+                            <w:proofErr w:type="spellEnd"/>
+                            <w:r>
+                              <w:t xml:space="preserve">/ISBN : Az adott ISBN-el rendelkező könyvet mutatja meg. </w:t>
                             </w:r>
                           </w:p>
                           <w:p>
@@ -850,7 +825,12 @@
                             </w:r>
                             <w:proofErr w:type="spellEnd"/>
                             <w:r>
-                              <w:t xml:space="preserve">, és a termék táblákból történik a törlés. </w:t>
+                              <w:t>,</w:t>
+                            </w:r>
+                            <w:bookmarkStart w:id="0" w:name="_GoBack"/>
+                            <w:bookmarkEnd w:id="0"/>
+                            <w:r>
+                              <w:t xml:space="preserve"> és a termék táblákból történik a törlés. </w:t>
                             </w:r>
                           </w:p>
                         </w:txbxContent>
@@ -881,7 +861,13 @@
                   <w:txbxContent>
                     <w:p>
                       <w:r>
-                        <w:t xml:space="preserve">Az oldal végpontjai a következők: </w:t>
+                        <w:t>Az oldal</w:t>
+                      </w:r>
+                      <w:r>
+                        <w:t xml:space="preserve"> a felhasználó által használható</w:t>
+                      </w:r>
+                      <w:r>
+                        <w:t xml:space="preserve"> végpontjai a következők: </w:t>
                       </w:r>
                     </w:p>
                     <w:p>
@@ -953,20 +939,11 @@
                       </w:r>
                       <w:proofErr w:type="spellStart"/>
                       <w:r>
-                        <w:t>search?</w:t>
-                      </w:r>
-                      <w:r>
-                        <w:t>illusz</w:t>
+                        <w:t>search?illusz</w:t>
                       </w:r>
                       <w:proofErr w:type="spellEnd"/>
                       <w:r>
-                        <w:t>=’’ : A</w:t>
-                      </w:r>
-                      <w:r>
-                        <w:t>z illusztrátorok</w:t>
-                      </w:r>
-                      <w:r>
-                        <w:t xml:space="preserve"> neve alapján szűr. </w:t>
+                        <w:t xml:space="preserve">=’’ : Az illusztrátorok neve alapján szűr. </w:t>
                       </w:r>
                     </w:p>
                     <w:p>
@@ -990,20 +967,11 @@
                       </w:r>
                       <w:proofErr w:type="spellStart"/>
                       <w:r>
-                        <w:t>search?</w:t>
-                      </w:r>
-                      <w:r>
-                        <w:t>nyelv</w:t>
+                        <w:t>search?nyelv</w:t>
                       </w:r>
                       <w:proofErr w:type="spellEnd"/>
                       <w:r>
-                        <w:t xml:space="preserve">=’’ : A </w:t>
-                      </w:r>
-                      <w:r>
-                        <w:t xml:space="preserve">nyelv </w:t>
-                      </w:r>
-                      <w:r>
-                        <w:t xml:space="preserve">alapján szűr. </w:t>
+                        <w:t xml:space="preserve">=’’ : A nyelv alapján szűr. </w:t>
                       </w:r>
                     </w:p>
                     <w:p>
@@ -1027,20 +995,11 @@
                       </w:r>
                       <w:proofErr w:type="spellStart"/>
                       <w:r>
-                        <w:t>search?</w:t>
-                      </w:r>
-                      <w:r>
-                        <w:t>kat</w:t>
+                        <w:t>search?kat</w:t>
                       </w:r>
                       <w:proofErr w:type="spellEnd"/>
                       <w:r>
-                        <w:t xml:space="preserve">=’’ : A </w:t>
-                      </w:r>
-                      <w:r>
-                        <w:t>kategóriák</w:t>
-                      </w:r>
-                      <w:r>
-                        <w:t xml:space="preserve"> alapján szűr. </w:t>
+                        <w:t xml:space="preserve">=’’ : A kategóriák alapján szűr. </w:t>
                       </w:r>
                     </w:p>
                     <w:p>
@@ -1064,20 +1023,11 @@
                       </w:r>
                       <w:proofErr w:type="spellStart"/>
                       <w:r>
-                        <w:t>search?</w:t>
-                      </w:r>
-                      <w:r>
-                        <w:t>kiado</w:t>
+                        <w:t>search?kiado</w:t>
                       </w:r>
                       <w:proofErr w:type="spellEnd"/>
                       <w:r>
-                        <w:t xml:space="preserve">=’’ : A </w:t>
-                      </w:r>
-                      <w:r>
-                        <w:t>kiadó</w:t>
-                      </w:r>
-                      <w:r>
-                        <w:t xml:space="preserve"> alapján szűr. </w:t>
+                        <w:t xml:space="preserve">=’’ : A kiadó alapján szűr. </w:t>
                       </w:r>
                     </w:p>
                     <w:p>
@@ -1101,20 +1051,31 @@
                       </w:r>
                       <w:proofErr w:type="spellStart"/>
                       <w:r>
-                        <w:t>search?</w:t>
-                      </w:r>
-                      <w:r>
-                        <w:t>cim</w:t>
+                        <w:t>search?cim</w:t>
                       </w:r>
                       <w:proofErr w:type="spellEnd"/>
                       <w:r>
-                        <w:t xml:space="preserve">=’’ : A </w:t>
-                      </w:r>
-                      <w:r>
-                        <w:t>cím</w:t>
-                      </w:r>
-                      <w:r>
-                        <w:t xml:space="preserve"> alapján szűr. </w:t>
+                        <w:t xml:space="preserve">=’’ : A cím alapján szűr. </w:t>
+                      </w:r>
+                    </w:p>
+                    <w:p>
+                      <w:pPr>
+                        <w:pStyle w:val="Listaszerbekezds"/>
+                        <w:numPr>
+                          <w:ilvl w:val="0"/>
+                          <w:numId w:val="2"/>
+                        </w:numPr>
+                      </w:pPr>
+                      <w:r>
+                        <w:t>/</w:t>
+                      </w:r>
+                      <w:proofErr w:type="spellStart"/>
+                      <w:r>
+                        <w:t>konyvek</w:t>
+                      </w:r>
+                      <w:proofErr w:type="spellEnd"/>
+                      <w:r>
+                        <w:t xml:space="preserve">/ISBN : Az adott ISBN-el rendelkező könyvet mutatja meg. </w:t>
                       </w:r>
                     </w:p>
                     <w:p>
@@ -1166,7 +1127,12 @@
                       </w:r>
                       <w:proofErr w:type="spellEnd"/>
                       <w:r>
-                        <w:t xml:space="preserve">, és a termék táblákból történik a törlés. </w:t>
+                        <w:t>,</w:t>
+                      </w:r>
+                      <w:bookmarkStart w:id="1" w:name="_GoBack"/>
+                      <w:bookmarkEnd w:id="1"/>
+                      <w:r>
+                        <w:t xml:space="preserve"> és a termék táblákból történik a törlés. </w:t>
                       </w:r>
                     </w:p>
                   </w:txbxContent>

</xml_diff>

<commit_message>
Dokumentáció + few changes
</commit_message>
<xml_diff>
--- a/backend/Projekt feladat.docx
+++ b/backend/Projekt feladat.docx
@@ -25,270 +25,16 @@
     </w:p>
     <w:p>
       <w:pPr>
-        <w:pStyle w:val="Listaszerbekezds"/>
-        <w:numPr>
-          <w:ilvl w:val="0"/>
-          <w:numId w:val="1"/>
-        </w:numPr>
-      </w:pPr>
-      <w:r>
-        <w:t>Nyelv: Milyen nyelven áruljuk a könyvet (VARCHAR(150)),</w:t>
-      </w:r>
-      <w:r>
-        <w:t xml:space="preserve"> </w:t>
-      </w:r>
-      <w:r>
-        <w:t>egyedi azonosítóval (INT).</w:t>
-      </w:r>
-    </w:p>
-    <w:p>
-      <w:pPr>
-        <w:pStyle w:val="Listaszerbekezds"/>
-        <w:numPr>
-          <w:ilvl w:val="0"/>
-          <w:numId w:val="1"/>
-        </w:numPr>
-      </w:pPr>
-      <w:r>
-        <w:t>Kiadó: Ki adta ki a könyvet (VARCHAR(150)),</w:t>
-      </w:r>
-      <w:r>
-        <w:t xml:space="preserve"> </w:t>
-      </w:r>
-      <w:r>
-        <w:t>egyedi azonosítóval (INT).</w:t>
-      </w:r>
-    </w:p>
-    <w:p>
-      <w:pPr>
-        <w:pStyle w:val="Listaszerbekezds"/>
-        <w:numPr>
-          <w:ilvl w:val="0"/>
-          <w:numId w:val="1"/>
-        </w:numPr>
-      </w:pPr>
-      <w:r>
-        <w:t xml:space="preserve">Illusztráció: Milyen </w:t>
-      </w:r>
-      <w:r>
-        <w:t>illusztrációk találhatók a könyvben (VARCHAR(150)), egyedi azonosítóval (INT).</w:t>
-      </w:r>
-    </w:p>
-    <w:p>
-      <w:pPr>
-        <w:pStyle w:val="Listaszerbekezds"/>
-        <w:numPr>
-          <w:ilvl w:val="0"/>
-          <w:numId w:val="1"/>
-        </w:numPr>
-      </w:pPr>
-      <w:r>
-        <w:t xml:space="preserve">Kategória: Milyen kategóriában található a könyv (VARCHAR(150)) egyedi azonosítóval (INT) és önmagára mutató azonosítóval (INT). </w:t>
-      </w:r>
-    </w:p>
-    <w:p>
-      <w:pPr>
-        <w:pStyle w:val="Listaszerbekezds"/>
-        <w:numPr>
-          <w:ilvl w:val="0"/>
-          <w:numId w:val="1"/>
-        </w:numPr>
-      </w:pPr>
-      <w:r>
-        <w:t xml:space="preserve">Szerző: Ki(k) </w:t>
-      </w:r>
-      <w:r>
-        <w:t xml:space="preserve">a könyv szerzői </w:t>
-      </w:r>
-      <w:r>
-        <w:t>(VARCHAR(150)), egyedi azonosítóval (INT).</w:t>
-      </w:r>
-    </w:p>
-    <w:p>
-      <w:pPr>
-        <w:pStyle w:val="Listaszerbekezds"/>
-        <w:numPr>
-          <w:ilvl w:val="0"/>
-          <w:numId w:val="1"/>
-        </w:numPr>
-      </w:pPr>
-      <w:r>
-        <w:t xml:space="preserve">Fordító: Ki(k) </w:t>
-      </w:r>
-      <w:r>
-        <w:t xml:space="preserve">a könyv fordítói </w:t>
-      </w:r>
-      <w:r>
-        <w:t>(VARCHAR(150)), egyedi azonosítóval (INT).</w:t>
-      </w:r>
-    </w:p>
-    <w:p>
-      <w:pPr>
-        <w:pStyle w:val="Listaszerbekezds"/>
-        <w:numPr>
-          <w:ilvl w:val="0"/>
-          <w:numId w:val="1"/>
-        </w:numPr>
-      </w:pPr>
-      <w:r>
-        <w:t xml:space="preserve">Illusztrátor: Ki(k) </w:t>
-      </w:r>
-      <w:r>
-        <w:t>a könyv illusztrátorai</w:t>
-      </w:r>
-      <w:r>
-        <w:t xml:space="preserve"> (VARCHAR(150)), egyedi azonosítóval (INT).</w:t>
-      </w:r>
-    </w:p>
-    <w:p>
-      <w:pPr>
-        <w:pStyle w:val="Listaszerbekezds"/>
-        <w:numPr>
-          <w:ilvl w:val="0"/>
-          <w:numId w:val="1"/>
-        </w:numPr>
-      </w:pPr>
-      <w:r>
-        <w:t>Kapcsoló fordító: Egy fordító több művet is fordíthat és többen is fordíthatnak egy művet.</w:t>
-      </w:r>
-      <w:r>
-        <w:t xml:space="preserve"> A termék ISBN-jével kötjük fordító azonosítóját.</w:t>
-      </w:r>
-    </w:p>
-    <w:p>
-      <w:pPr>
-        <w:pStyle w:val="Listaszerbekezds"/>
-        <w:numPr>
-          <w:ilvl w:val="0"/>
-          <w:numId w:val="1"/>
-        </w:numPr>
-      </w:pPr>
-      <w:r>
-        <w:t>Kapcsoló Szerző: Egy szerző több művet is írhatott és egy művet több szerző is írhatott. A termék ISBN-jével kötjük a szerző azonosítóját.</w:t>
-      </w:r>
-    </w:p>
-    <w:p>
-      <w:pPr>
-        <w:pStyle w:val="Listaszerbekezds"/>
-        <w:numPr>
-          <w:ilvl w:val="0"/>
-          <w:numId w:val="1"/>
-        </w:numPr>
-      </w:pPr>
-      <w:r>
-        <w:t>Kapcsoló Illusztrátor: Egy illusztrátor több művet is illusztrálhatott és egy művet több illusztrátor is illusztrálhatott. A termék ISBN-jével kötjük az illusztrátor azonosítóját.</w:t>
-      </w:r>
-    </w:p>
-    <w:p>
-      <w:pPr>
-        <w:pStyle w:val="Listaszerbekezds"/>
-        <w:numPr>
-          <w:ilvl w:val="0"/>
-          <w:numId w:val="1"/>
-        </w:numPr>
-      </w:pPr>
-      <w:r>
-        <w:t xml:space="preserve">Termék: Egy könyv adatait tároljuk el a táblában. Egyedi azonosítója az ISBN (BIGINT). </w:t>
-      </w:r>
-    </w:p>
-    <w:p>
-      <w:pPr>
-        <w:pStyle w:val="Listaszerbekezds"/>
-        <w:numPr>
-          <w:ilvl w:val="0"/>
-          <w:numId w:val="1"/>
-        </w:numPr>
-      </w:pPr>
-      <w:r>
-        <w:t>Kapcsoló számla: Egy vevő több terméket is vehet és egy terméket több vevő is vásárolhat. A termék ISBN-jével kötjük a számla azonosítóját</w:t>
-      </w:r>
-      <w:r>
-        <w:t>.</w:t>
-      </w:r>
-    </w:p>
-    <w:p>
-      <w:pPr>
-        <w:pStyle w:val="Listaszerbekezds"/>
-        <w:numPr>
-          <w:ilvl w:val="0"/>
-          <w:numId w:val="1"/>
-        </w:numPr>
-      </w:pPr>
-      <w:r>
-        <w:t xml:space="preserve">Számla: A számla adatait tároljuk el. Egyedi azonosítója a </w:t>
-      </w:r>
-      <w:proofErr w:type="spellStart"/>
-      <w:r>
-        <w:t>Számla_id</w:t>
-      </w:r>
-      <w:proofErr w:type="spellEnd"/>
-      <w:r>
-        <w:t xml:space="preserve"> (INT). Számlaszám (VARCHAR) mivel </w:t>
-      </w:r>
-      <w:r>
-        <w:t>a formátuma DÁTUM/SZÁMLA_ID.</w:t>
-      </w:r>
-    </w:p>
-    <w:p>
-      <w:pPr>
-        <w:pStyle w:val="Listaszerbekezds"/>
-        <w:numPr>
-          <w:ilvl w:val="0"/>
-          <w:numId w:val="1"/>
-        </w:numPr>
-      </w:pPr>
-      <w:r>
-        <w:t xml:space="preserve">Vevő: A vásárló adatait tároljuk el. Egyedi azonosítója </w:t>
-      </w:r>
-      <w:proofErr w:type="spellStart"/>
-      <w:r>
-        <w:t>az_id</w:t>
-      </w:r>
-      <w:proofErr w:type="spellEnd"/>
-      <w:r>
-        <w:t xml:space="preserve"> (INT). Az adószám lehet NULL mivel magánszemélynek nem kell megadni az adószámát.</w:t>
-      </w:r>
-    </w:p>
-    <w:p>
-      <w:pPr>
-        <w:pStyle w:val="Listaszerbekezds"/>
-        <w:numPr>
-          <w:ilvl w:val="0"/>
-          <w:numId w:val="1"/>
-        </w:numPr>
         <w:rPr>
           <w:noProof/>
         </w:rPr>
       </w:pPr>
-      <w:r>
-        <w:t xml:space="preserve">Fizetési mód: Milyen módokon lehet fizetni. (VARCHAR(150)), Egyedi azonosítója az </w:t>
-      </w:r>
-      <w:proofErr w:type="spellStart"/>
-      <w:r>
-        <w:t>id</w:t>
-      </w:r>
-      <w:proofErr w:type="spellEnd"/>
-      <w:r>
-        <w:t xml:space="preserve"> (INT).</w:t>
-      </w:r>
       <w:r>
         <w:rPr>
           <w:noProof/>
         </w:rPr>
         <w:t xml:space="preserve"> </w:t>
       </w:r>
-    </w:p>
-    <w:p>
-      <w:pPr>
-        <w:pStyle w:val="Listaszerbekezds"/>
-        <w:numPr>
-          <w:ilvl w:val="0"/>
-          <w:numId w:val="1"/>
-        </w:numPr>
-        <w:rPr>
-          <w:noProof/>
-        </w:rPr>
-      </w:pPr>
       <w:r>
         <w:rPr>
           <w:noProof/>
@@ -350,12 +96,6 @@
           </wp:anchor>
         </w:drawing>
       </w:r>
-      <w:r>
-        <w:rPr>
-          <w:noProof/>
-        </w:rPr>
-        <w:t xml:space="preserve">Szállítás: Milyen szállítási módok vehetők igénybe (VARCHAR(150)), Egyedi azonosítója az id (INT) </w:t>
-      </w:r>
     </w:p>
     <w:p>
       <w:pPr>
@@ -370,6 +110,67 @@
           <w:noProof/>
         </w:rPr>
       </w:pPr>
+      <w:r>
+        <w:rPr>
+          <w:noProof/>
+          <w:lang w:eastAsia="hu-HU"/>
+        </w:rPr>
+        <w:drawing>
+          <wp:anchor distT="0" distB="0" distL="114300" distR="114300" simplePos="0" relativeHeight="251661312" behindDoc="1" locked="0" layoutInCell="1" allowOverlap="1" wp14:anchorId="6F05E83B">
+            <wp:simplePos x="0" y="0"/>
+            <wp:positionH relativeFrom="margin">
+              <wp:align>left</wp:align>
+            </wp:positionH>
+            <wp:positionV relativeFrom="paragraph">
+              <wp:posOffset>3629412</wp:posOffset>
+            </wp:positionV>
+            <wp:extent cx="5760720" cy="3640455"/>
+            <wp:effectExtent l="0" t="0" r="0" b="0"/>
+            <wp:wrapNone/>
+            <wp:docPr id="4" name="Kép 4"/>
+            <wp:cNvGraphicFramePr>
+              <a:graphicFrameLocks xmlns:a="http://schemas.openxmlformats.org/drawingml/2006/main" noChangeAspect="1"/>
+            </wp:cNvGraphicFramePr>
+            <a:graphic xmlns:a="http://schemas.openxmlformats.org/drawingml/2006/main">
+              <a:graphicData uri="http://schemas.openxmlformats.org/drawingml/2006/picture">
+                <pic:pic xmlns:pic="http://schemas.openxmlformats.org/drawingml/2006/picture">
+                  <pic:nvPicPr>
+                    <pic:cNvPr id="1" name=""/>
+                    <pic:cNvPicPr/>
+                  </pic:nvPicPr>
+                  <pic:blipFill>
+                    <a:blip r:embed="rId6">
+                      <a:extLst>
+                        <a:ext uri="{28A0092B-C50C-407E-A947-70E740481C1C}">
+                          <a14:useLocalDpi xmlns:a14="http://schemas.microsoft.com/office/drawing/2010/main" val="0"/>
+                        </a:ext>
+                      </a:extLst>
+                    </a:blip>
+                    <a:stretch>
+                      <a:fillRect/>
+                    </a:stretch>
+                  </pic:blipFill>
+                  <pic:spPr>
+                    <a:xfrm>
+                      <a:off x="0" y="0"/>
+                      <a:ext cx="5760720" cy="3640455"/>
+                    </a:xfrm>
+                    <a:prstGeom prst="rect">
+                      <a:avLst/>
+                    </a:prstGeom>
+                  </pic:spPr>
+                </pic:pic>
+              </a:graphicData>
+            </a:graphic>
+            <wp14:sizeRelH relativeFrom="margin">
+              <wp14:pctWidth>0</wp14:pctWidth>
+            </wp14:sizeRelH>
+            <wp14:sizeRelV relativeFrom="margin">
+              <wp14:pctHeight>0</wp14:pctHeight>
+            </wp14:sizeRelV>
+          </wp:anchor>
+        </w:drawing>
+      </w:r>
       <w:r>
         <w:rPr>
           <w:noProof/>
@@ -399,7 +200,7 @@
                     <pic:cNvPicPr/>
                   </pic:nvPicPr>
                   <pic:blipFill>
-                    <a:blip r:embed="rId6">
+                    <a:blip r:embed="rId7">
                       <a:extLst>
                         <a:ext uri="{28A0092B-C50C-407E-A947-70E740481C1C}">
                           <a14:useLocalDpi xmlns:a14="http://schemas.microsoft.com/office/drawing/2010/main" val="0"/>
@@ -449,90 +250,6 @@
           <w:noProof/>
         </w:rPr>
         <w:br/>
-      </w:r>
-      <w:r>
-        <w:rPr>
-          <w:noProof/>
-        </w:rPr>
-        <w:br/>
-      </w:r>
-      <w:r>
-        <w:rPr>
-          <w:noProof/>
-        </w:rPr>
-        <w:br/>
-      </w:r>
-      <w:r>
-        <w:rPr>
-          <w:noProof/>
-        </w:rPr>
-        <w:br/>
-      </w:r>
-      <w:r>
-        <w:rPr>
-          <w:noProof/>
-        </w:rPr>
-        <w:br/>
-      </w:r>
-      <w:r>
-        <w:rPr>
-          <w:noProof/>
-        </w:rPr>
-        <w:br/>
-      </w:r>
-      <w:r>
-        <w:rPr>
-          <w:noProof/>
-        </w:rPr>
-        <w:br/>
-      </w:r>
-      <w:r>
-        <w:rPr>
-          <w:noProof/>
-        </w:rPr>
-        <w:br/>
-      </w:r>
-      <w:r>
-        <w:rPr>
-          <w:noProof/>
-        </w:rPr>
-        <w:br/>
-      </w:r>
-      <w:r>
-        <w:rPr>
-          <w:noProof/>
-        </w:rPr>
-        <w:br/>
-      </w:r>
-      <w:r>
-        <w:rPr>
-          <w:noProof/>
-        </w:rPr>
-        <w:br/>
-      </w:r>
-      <w:r>
-        <w:rPr>
-          <w:noProof/>
-        </w:rPr>
-        <w:br/>
-      </w:r>
-      <w:r>
-        <w:rPr>
-          <w:noProof/>
-        </w:rPr>
-        <w:br/>
-      </w:r>
-      <w:r>
-        <w:rPr>
-          <w:noProof/>
-        </w:rPr>
-        <w:br/>
-      </w:r>
-      <w:r>
-        <w:rPr>
-          <w:noProof/>
-        </w:rPr>
-        <w:br/>
         <w:t>1.1. Borító tábla:</w:t>
       </w:r>
       <w:r>
@@ -540,67 +257,6 @@
           <w:noProof/>
         </w:rPr>
         <w:br/>
-      </w:r>
-      <w:r>
-        <w:rPr>
-          <w:noProof/>
-          <w:lang w:eastAsia="hu-HU"/>
-        </w:rPr>
-        <w:drawing>
-          <wp:anchor distT="0" distB="0" distL="114300" distR="114300" simplePos="0" relativeHeight="251661312" behindDoc="1" locked="0" layoutInCell="1" allowOverlap="1" wp14:anchorId="6F05E83B">
-            <wp:simplePos x="0" y="0"/>
-            <wp:positionH relativeFrom="margin">
-              <wp:posOffset>-101407</wp:posOffset>
-            </wp:positionH>
-            <wp:positionV relativeFrom="paragraph">
-              <wp:posOffset>-833617</wp:posOffset>
-            </wp:positionV>
-            <wp:extent cx="5760720" cy="3640455"/>
-            <wp:effectExtent l="0" t="0" r="0" b="0"/>
-            <wp:wrapNone/>
-            <wp:docPr id="4" name="Kép 4"/>
-            <wp:cNvGraphicFramePr>
-              <a:graphicFrameLocks xmlns:a="http://schemas.openxmlformats.org/drawingml/2006/main" noChangeAspect="1"/>
-            </wp:cNvGraphicFramePr>
-            <a:graphic xmlns:a="http://schemas.openxmlformats.org/drawingml/2006/main">
-              <a:graphicData uri="http://schemas.openxmlformats.org/drawingml/2006/picture">
-                <pic:pic xmlns:pic="http://schemas.openxmlformats.org/drawingml/2006/picture">
-                  <pic:nvPicPr>
-                    <pic:cNvPr id="1" name=""/>
-                    <pic:cNvPicPr/>
-                  </pic:nvPicPr>
-                  <pic:blipFill>
-                    <a:blip r:embed="rId7">
-                      <a:extLst>
-                        <a:ext uri="{28A0092B-C50C-407E-A947-70E740481C1C}">
-                          <a14:useLocalDpi xmlns:a14="http://schemas.microsoft.com/office/drawing/2010/main" val="0"/>
-                        </a:ext>
-                      </a:extLst>
-                    </a:blip>
-                    <a:stretch>
-                      <a:fillRect/>
-                    </a:stretch>
-                  </pic:blipFill>
-                  <pic:spPr>
-                    <a:xfrm>
-                      <a:off x="0" y="0"/>
-                      <a:ext cx="5760720" cy="3640455"/>
-                    </a:xfrm>
-                    <a:prstGeom prst="rect">
-                      <a:avLst/>
-                    </a:prstGeom>
-                  </pic:spPr>
-                </pic:pic>
-              </a:graphicData>
-            </a:graphic>
-            <wp14:sizeRelH relativeFrom="margin">
-              <wp14:pctWidth>0</wp14:pctWidth>
-            </wp14:sizeRelH>
-            <wp14:sizeRelV relativeFrom="margin">
-              <wp14:pctHeight>0</wp14:pctHeight>
-            </wp14:sizeRelV>
-          </wp:anchor>
-        </w:drawing>
       </w:r>
       <w:r>
         <w:t xml:space="preserve"> </w:t>
@@ -829,7 +485,7 @@
                         <pic:spPr>
                           <a:xfrm>
                             <a:off x="0" y="0"/>
-                            <a:ext cx="2086268" cy="1467056"/>
+                            <a:ext cx="2092003" cy="1471089"/>
                           </a:xfrm>
                           <a:prstGeom prst="rect">
                             <a:avLst/>
@@ -974,7 +630,6 @@
                 <w:noProof/>
                 <w:lang w:eastAsia="hu-HU"/>
               </w:rPr>
-              <w:lastRenderedPageBreak/>
               <w:drawing>
                 <wp:inline distT="0" distB="0" distL="0" distR="0" wp14:anchorId="232DDB79" wp14:editId="6A24EFDB">
                   <wp:extent cx="2029108" cy="1428949"/>
@@ -1128,6 +783,7 @@
                 <w:noProof/>
                 <w:lang w:eastAsia="hu-HU"/>
               </w:rPr>
+              <w:lastRenderedPageBreak/>
               <w:drawing>
                 <wp:inline distT="0" distB="0" distL="0" distR="0" wp14:anchorId="7A5D7023" wp14:editId="15D8A5EC">
                   <wp:extent cx="2048161" cy="1428949"/>
@@ -1564,7 +1220,6 @@
     <w:p/>
     <w:p>
       <w:r>
-        <w:lastRenderedPageBreak/>
         <w:t>1.7:</w:t>
       </w:r>
       <w:r>
@@ -1723,6 +1378,7 @@
     <w:p/>
     <w:p>
       <w:r>
+        <w:lastRenderedPageBreak/>
         <w:t>1.8:</w:t>
       </w:r>
       <w:r>
@@ -2214,7 +1870,6 @@
     </w:tbl>
     <w:p>
       <w:r>
-        <w:lastRenderedPageBreak/>
         <w:t>1.11: Kapcsoló Szerző</w:t>
       </w:r>
     </w:p>
@@ -2275,6 +1930,7 @@
                 <w:noProof/>
                 <w:lang w:eastAsia="hu-HU"/>
               </w:rPr>
+              <w:lastRenderedPageBreak/>
               <w:drawing>
                 <wp:inline distT="0" distB="0" distL="0" distR="0" wp14:anchorId="6E49B7DC" wp14:editId="5720CBF2">
                   <wp:extent cx="1867161" cy="2067213"/>
@@ -2957,19 +2613,13 @@
     <w:p/>
     <w:p>
       <w:r>
-        <w:t>1.14:</w:t>
+        <w:t>1.1</w:t>
       </w:r>
       <w:r>
-        <w:t xml:space="preserve"> </w:t>
+        <w:t>4</w:t>
       </w:r>
       <w:r>
-        <w:t>Kapcsoló szá</w:t>
-      </w:r>
-      <w:r>
-        <w:t>mla</w:t>
-      </w:r>
-      <w:r>
-        <w:t>:</w:t>
+        <w:t>: Számla:</w:t>
       </w:r>
     </w:p>
     <w:tbl>
@@ -2989,7 +2639,7 @@
           </w:tcPr>
           <w:p>
             <w:r>
-              <w:t>Kapcsoló számla</w:t>
+              <w:t>Számla</w:t>
             </w:r>
             <w:r>
               <w:t>:</w:t>
@@ -3019,13 +2669,12 @@
             <w:r>
               <w:rPr>
                 <w:noProof/>
-                <w:lang w:eastAsia="hu-HU"/>
               </w:rPr>
               <w:drawing>
-                <wp:inline distT="0" distB="0" distL="0" distR="0" wp14:anchorId="73E77F7D" wp14:editId="5529C7D5">
-                  <wp:extent cx="1638529" cy="2229161"/>
-                  <wp:effectExtent l="0" t="0" r="0" b="0"/>
-                  <wp:docPr id="9" name="Kép 9"/>
+                <wp:inline distT="0" distB="0" distL="0" distR="0" wp14:anchorId="6577FEF1" wp14:editId="22705461">
+                  <wp:extent cx="2038635" cy="2734057"/>
+                  <wp:effectExtent l="0" t="0" r="0" b="9525"/>
+                  <wp:docPr id="12" name="Kép 12"/>
                   <wp:cNvGraphicFramePr>
                     <a:graphicFrameLocks xmlns:a="http://schemas.openxmlformats.org/drawingml/2006/main" noChangeAspect="1"/>
                   </wp:cNvGraphicFramePr>
@@ -3045,7 +2694,7 @@
                         <pic:spPr>
                           <a:xfrm>
                             <a:off x="0" y="0"/>
-                            <a:ext cx="1638529" cy="2229161"/>
+                            <a:ext cx="2038635" cy="2734057"/>
                           </a:xfrm>
                           <a:prstGeom prst="rect">
                             <a:avLst/>
@@ -3065,7 +2714,7 @@
           </w:tcPr>
           <w:p>
             <w:r>
-              <w:t>Kapcsoló számla tábla:</w:t>
+              <w:t>Számla tábla:</w:t>
             </w:r>
           </w:p>
           <w:p>
@@ -3078,7 +2727,7 @@
             </w:pPr>
             <w:proofErr w:type="spellStart"/>
             <w:r>
-              <w:t>id</w:t>
+              <w:t>szamla_id</w:t>
             </w:r>
             <w:proofErr w:type="spellEnd"/>
             <w:r>
@@ -3109,8 +2758,21 @@
                 <w:numId w:val="5"/>
               </w:numPr>
             </w:pPr>
-            <w:r>
-              <w:t>ISBN BIGINT: A termék táblából származik. Így tudjuk azonosítani melyik könyv tartozik az adott számlához.</w:t>
+            <w:proofErr w:type="spellStart"/>
+            <w:r>
+              <w:t>fizetési_mód</w:t>
+            </w:r>
+            <w:proofErr w:type="spellEnd"/>
+            <w:r>
+              <w:t xml:space="preserve"> (INT): A fizetési mód táblából származik. Így tudjuk azonosítani hogy a vevő milyen fizetési </w:t>
+            </w:r>
+            <w:proofErr w:type="spellStart"/>
+            <w:r>
+              <w:t>móddot</w:t>
+            </w:r>
+            <w:proofErr w:type="spellEnd"/>
+            <w:r>
+              <w:t xml:space="preserve"> választott.</w:t>
             </w:r>
           </w:p>
           <w:p>
@@ -3123,19 +2785,11 @@
             </w:pPr>
             <w:proofErr w:type="spellStart"/>
             <w:r>
-              <w:t>szamla_id</w:t>
-            </w:r>
-            <w:proofErr w:type="spellEnd"/>
-            <w:r>
-              <w:t xml:space="preserve"> INT: Az számla táblából származik. Az számla </w:t>
-            </w:r>
-            <w:proofErr w:type="spellStart"/>
-            <w:r>
-              <w:t>id-jével</w:t>
-            </w:r>
-            <w:proofErr w:type="spellEnd"/>
-            <w:r>
-              <w:t xml:space="preserve"> tudjuk azonosítani a számlát.</w:t>
+              <w:t>teljesítés_kelte</w:t>
+            </w:r>
+            <w:proofErr w:type="spellEnd"/>
+            <w:r>
+              <w:t xml:space="preserve"> (DATE): Mikor teljesítették a fizetést.</w:t>
             </w:r>
           </w:p>
           <w:p>
@@ -3146,8 +2800,87 @@
                 <w:numId w:val="5"/>
               </w:numPr>
             </w:pPr>
-            <w:r>
-              <w:t>darab (INT): Hány darabot vásároltunk az adott könyvből.</w:t>
+            <w:proofErr w:type="spellStart"/>
+            <w:r>
+              <w:t>szamla</w:t>
+            </w:r>
+            <w:r>
+              <w:t>_kelte</w:t>
+            </w:r>
+            <w:proofErr w:type="spellEnd"/>
+            <w:r>
+              <w:t xml:space="preserve"> (DATE): Mikor </w:t>
+            </w:r>
+            <w:r>
+              <w:t xml:space="preserve">adták le </w:t>
+            </w:r>
+            <w:r>
+              <w:t xml:space="preserve">a </w:t>
+            </w:r>
+            <w:r>
+              <w:t>rendelést</w:t>
+            </w:r>
+            <w:r>
+              <w:t>.</w:t>
+            </w:r>
+          </w:p>
+          <w:p>
+            <w:pPr>
+              <w:pStyle w:val="Listaszerbekezds"/>
+              <w:numPr>
+                <w:ilvl w:val="0"/>
+                <w:numId w:val="5"/>
+              </w:numPr>
+            </w:pPr>
+            <w:proofErr w:type="spellStart"/>
+            <w:r>
+              <w:t>Fizetési</w:t>
+            </w:r>
+            <w:r>
+              <w:t>_</w:t>
+            </w:r>
+            <w:r>
+              <w:t>határido</w:t>
+            </w:r>
+            <w:proofErr w:type="spellEnd"/>
+            <w:r>
+              <w:t xml:space="preserve"> (DATE): M</w:t>
+            </w:r>
+            <w:r>
+              <w:t>eddig kell a fizetést végbe vinni</w:t>
+            </w:r>
+            <w:r>
+              <w:t>.</w:t>
+            </w:r>
+          </w:p>
+          <w:p>
+            <w:pPr>
+              <w:pStyle w:val="Listaszerbekezds"/>
+              <w:numPr>
+                <w:ilvl w:val="0"/>
+                <w:numId w:val="5"/>
+              </w:numPr>
+            </w:pPr>
+            <w:proofErr w:type="spellStart"/>
+            <w:r>
+              <w:t>vevo_id</w:t>
+            </w:r>
+            <w:proofErr w:type="spellEnd"/>
+            <w:r>
+              <w:t xml:space="preserve"> (INT): A vevő táblából származik. Így tudjuk azonosítani hogy melyik vevőhöz tartozik a  számla.</w:t>
+            </w:r>
+          </w:p>
+          <w:p>
+            <w:pPr>
+              <w:pStyle w:val="Listaszerbekezds"/>
+              <w:numPr>
+                <w:ilvl w:val="0"/>
+                <w:numId w:val="5"/>
+              </w:numPr>
+            </w:pPr>
+            <w:r>
+              <w:lastRenderedPageBreak/>
+              <w:t>számlaszám (VARCHAR): Az számla azonosítója így tudjuk azonosítani ha valaki több könyvet rendelt egy rendelésben. Felépítése: ÉV/VEVO_ID/HANYADIK SZÁMLA.</w:t>
             </w:r>
           </w:p>
         </w:tc>
@@ -3156,7 +2889,13 @@
     <w:p/>
     <w:p>
       <w:r>
-        <w:t>1.15: Számla:</w:t>
+        <w:t>1.1</w:t>
+      </w:r>
+      <w:r>
+        <w:t>5</w:t>
+      </w:r>
+      <w:r>
+        <w:t>: Vevő:</w:t>
       </w:r>
     </w:p>
     <w:tbl>
@@ -3176,7 +2915,7 @@
           </w:tcPr>
           <w:p>
             <w:r>
-              <w:t>Számla</w:t>
+              <w:t>Vevő</w:t>
             </w:r>
             <w:r>
               <w:t>:</w:t>
@@ -3207,12 +2946,11 @@
               <w:rPr>
                 <w:noProof/>
               </w:rPr>
-              <w:lastRenderedPageBreak/>
               <w:drawing>
-                <wp:inline distT="0" distB="0" distL="0" distR="0" wp14:anchorId="6577FEF1" wp14:editId="22705461">
-                  <wp:extent cx="2038635" cy="2734057"/>
-                  <wp:effectExtent l="0" t="0" r="0" b="9525"/>
-                  <wp:docPr id="12" name="Kép 12"/>
+                <wp:inline distT="0" distB="0" distL="0" distR="0" wp14:anchorId="11E4943E" wp14:editId="2F7FD457">
+                  <wp:extent cx="1800476" cy="2276793"/>
+                  <wp:effectExtent l="0" t="0" r="9525" b="9525"/>
+                  <wp:docPr id="16" name="Kép 16"/>
                   <wp:cNvGraphicFramePr>
                     <a:graphicFrameLocks xmlns:a="http://schemas.openxmlformats.org/drawingml/2006/main" noChangeAspect="1"/>
                   </wp:cNvGraphicFramePr>
@@ -3232,7 +2970,7 @@
                         <pic:spPr>
                           <a:xfrm>
                             <a:off x="0" y="0"/>
-                            <a:ext cx="2038635" cy="2734057"/>
+                            <a:ext cx="1800476" cy="2276793"/>
                           </a:xfrm>
                           <a:prstGeom prst="rect">
                             <a:avLst/>
@@ -3252,7 +2990,7 @@
           </w:tcPr>
           <w:p>
             <w:r>
-              <w:t>Számla tábla:</w:t>
+              <w:t>Vevő tábla:</w:t>
             </w:r>
           </w:p>
           <w:p>
@@ -3265,7 +3003,7 @@
             </w:pPr>
             <w:proofErr w:type="spellStart"/>
             <w:r>
-              <w:t>szamla_id</w:t>
+              <w:t>id</w:t>
             </w:r>
             <w:proofErr w:type="spellEnd"/>
             <w:r>
@@ -3296,21 +3034,8 @@
                 <w:numId w:val="5"/>
               </w:numPr>
             </w:pPr>
-            <w:proofErr w:type="spellStart"/>
-            <w:r>
-              <w:t>fizetési_mód</w:t>
-            </w:r>
-            <w:proofErr w:type="spellEnd"/>
-            <w:r>
-              <w:t xml:space="preserve"> (INT): A fizetési mód táblából származik. Így tudjuk azonosítani hogy a vevő milyen fizetési </w:t>
-            </w:r>
-            <w:proofErr w:type="spellStart"/>
-            <w:r>
-              <w:t>móddot</w:t>
-            </w:r>
-            <w:proofErr w:type="spellEnd"/>
-            <w:r>
-              <w:t xml:space="preserve"> választott.</w:t>
+            <w:r>
+              <w:t>Vevő Név (VARCHAR): A vevő neve.</w:t>
             </w:r>
           </w:p>
           <w:p>
@@ -3321,13 +3046,8 @@
                 <w:numId w:val="5"/>
               </w:numPr>
             </w:pPr>
-            <w:proofErr w:type="spellStart"/>
-            <w:r>
-              <w:t>teljesítés_kelte</w:t>
-            </w:r>
-            <w:proofErr w:type="spellEnd"/>
-            <w:r>
-              <w:t xml:space="preserve"> (DATE): Mikor teljesítették a fizetést.</w:t>
+            <w:r>
+              <w:t>Lakcím (VARCHAR): A vevő lakcíme.</w:t>
             </w:r>
           </w:p>
           <w:p>
@@ -3338,28 +3058,8 @@
                 <w:numId w:val="5"/>
               </w:numPr>
             </w:pPr>
-            <w:proofErr w:type="spellStart"/>
-            <w:r>
-              <w:t>szamla</w:t>
-            </w:r>
-            <w:r>
-              <w:t>_kelte</w:t>
-            </w:r>
-            <w:proofErr w:type="spellEnd"/>
-            <w:r>
-              <w:t xml:space="preserve"> (DATE): Mikor </w:t>
-            </w:r>
-            <w:r>
-              <w:t xml:space="preserve">adták le </w:t>
-            </w:r>
-            <w:r>
-              <w:t xml:space="preserve">a </w:t>
-            </w:r>
-            <w:r>
-              <w:t>rendelést</w:t>
-            </w:r>
-            <w:r>
-              <w:t>.</w:t>
+            <w:r>
+              <w:t>Email (VARCHAR): A vevő email címe. Nem lehet kettő ugyanolyan email cím az adatbázisban.</w:t>
             </w:r>
           </w:p>
           <w:p>
@@ -3370,25 +3070,11 @@
                 <w:numId w:val="5"/>
               </w:numPr>
             </w:pPr>
-            <w:proofErr w:type="spellStart"/>
-            <w:r>
-              <w:t>Fizetési</w:t>
-            </w:r>
-            <w:r>
-              <w:t>_</w:t>
-            </w:r>
-            <w:r>
-              <w:t>határido</w:t>
-            </w:r>
-            <w:proofErr w:type="spellEnd"/>
-            <w:r>
-              <w:t xml:space="preserve"> (DATE): M</w:t>
-            </w:r>
-            <w:r>
-              <w:t>eddig kell a fizetést végbe vinni</w:t>
-            </w:r>
-            <w:r>
-              <w:t>.</w:t>
+            <w:r>
+              <w:t xml:space="preserve">Adószám (VARCHAR): Ha a vásárló egy cég </w:t>
+            </w:r>
+            <w:r>
+              <w:t>akkor itt táróljuk az adószámát.</w:t>
             </w:r>
           </w:p>
           <w:p>
@@ -3399,13 +3085,24 @@
                 <w:numId w:val="5"/>
               </w:numPr>
             </w:pPr>
-            <w:proofErr w:type="spellStart"/>
-            <w:r>
-              <w:t>vevo_id</w:t>
-            </w:r>
-            <w:proofErr w:type="spellEnd"/>
-            <w:r>
-              <w:t xml:space="preserve"> (INT): A vevő táblából származik. Így tudjuk azonosítani hogy melyik vevőhöz tartozik a  számla.</w:t>
+            <w:r>
+              <w:t xml:space="preserve">jelszó (VARCHAR): A felhasználó </w:t>
+            </w:r>
+            <w:proofErr w:type="spellStart"/>
+            <w:r>
+              <w:t>jelszava</w:t>
+            </w:r>
+            <w:proofErr w:type="spellEnd"/>
+            <w:r>
+              <w:t xml:space="preserve"> </w:t>
+            </w:r>
+            <w:proofErr w:type="spellStart"/>
+            <w:r>
+              <w:t>elkódoltan</w:t>
+            </w:r>
+            <w:proofErr w:type="spellEnd"/>
+            <w:r>
+              <w:t xml:space="preserve">. </w:t>
             </w:r>
           </w:p>
           <w:p>
@@ -3416,8 +3113,29 @@
                 <w:numId w:val="5"/>
               </w:numPr>
             </w:pPr>
-            <w:r>
-              <w:t>számlaszám (VARCHAR): Az számla azonosítója így tudjuk azonosítani ha valaki több könyvet rendelt egy rendelésben. Felépítése: ÉV/VEVO_ID/HANYADIK SZÁMLA.</w:t>
+            <w:proofErr w:type="spellStart"/>
+            <w:r>
+              <w:t>jogosultsag</w:t>
+            </w:r>
+            <w:proofErr w:type="spellEnd"/>
+            <w:r>
+              <w:t xml:space="preserve"> (INT): Milyen jogosultsággal rendelkezik a felhasználó (</w:t>
+            </w:r>
+            <w:proofErr w:type="spellStart"/>
+            <w:r>
+              <w:t>Admin</w:t>
+            </w:r>
+            <w:proofErr w:type="spellEnd"/>
+            <w:r>
+              <w:t xml:space="preserve">, </w:t>
+            </w:r>
+            <w:proofErr w:type="spellStart"/>
+            <w:r>
+              <w:t>user</w:t>
+            </w:r>
+            <w:proofErr w:type="spellEnd"/>
+            <w:r>
+              <w:t>)</w:t>
             </w:r>
           </w:p>
         </w:tc>
@@ -3426,7 +3144,13 @@
     <w:p/>
     <w:p>
       <w:r>
-        <w:t>1.16: Vevő:</w:t>
+        <w:t>1.1</w:t>
+      </w:r>
+      <w:r>
+        <w:t>6</w:t>
+      </w:r>
+      <w:r>
+        <w:t>: Fizetési mód:</w:t>
       </w:r>
     </w:p>
     <w:tbl>
@@ -3446,10 +3170,7 @@
           </w:tcPr>
           <w:p>
             <w:r>
-              <w:t>Vevő</w:t>
-            </w:r>
-            <w:r>
-              <w:t>:</w:t>
+              <w:t>Fizetési mód:</w:t>
             </w:r>
           </w:p>
         </w:tc>
@@ -3478,10 +3199,10 @@
                 <w:noProof/>
               </w:rPr>
               <w:drawing>
-                <wp:inline distT="0" distB="0" distL="0" distR="0" wp14:anchorId="11E4943E" wp14:editId="2F7FD457">
-                  <wp:extent cx="1800476" cy="2276793"/>
-                  <wp:effectExtent l="0" t="0" r="9525" b="9525"/>
-                  <wp:docPr id="16" name="Kép 16"/>
+                <wp:inline distT="0" distB="0" distL="0" distR="0" wp14:anchorId="2F744834" wp14:editId="55FAF45F">
+                  <wp:extent cx="1733792" cy="1533739"/>
+                  <wp:effectExtent l="0" t="0" r="0" b="9525"/>
+                  <wp:docPr id="20" name="Kép 20"/>
                   <wp:cNvGraphicFramePr>
                     <a:graphicFrameLocks xmlns:a="http://schemas.openxmlformats.org/drawingml/2006/main" noChangeAspect="1"/>
                   </wp:cNvGraphicFramePr>
@@ -3501,7 +3222,7 @@
                         <pic:spPr>
                           <a:xfrm>
                             <a:off x="0" y="0"/>
-                            <a:ext cx="1800476" cy="2276793"/>
+                            <a:ext cx="1733792" cy="1533739"/>
                           </a:xfrm>
                           <a:prstGeom prst="rect">
                             <a:avLst/>
@@ -3521,7 +3242,7 @@
           </w:tcPr>
           <w:p>
             <w:r>
-              <w:t>Vevő tábla:</w:t>
+              <w:t>Fizetési mód tábla:</w:t>
             </w:r>
           </w:p>
           <w:p>
@@ -3566,116 +3287,38 @@
               </w:numPr>
             </w:pPr>
             <w:r>
-              <w:t>Vevő Név (VARCHAR): A vevő neve.</w:t>
+              <w:t>Fizetési név (VARCHAR): A fizetési mód neve (Kártya, utánvét stb.)</w:t>
             </w:r>
           </w:p>
           <w:p>
             <w:pPr>
               <w:pStyle w:val="Listaszerbekezds"/>
-              <w:numPr>
-                <w:ilvl w:val="0"/>
-                <w:numId w:val="5"/>
-              </w:numPr>
-            </w:pPr>
-            <w:r>
-              <w:t>Lakcím (VARCHAR): A vevő lakcíme.</w:t>
-            </w:r>
-          </w:p>
-          <w:p>
-            <w:pPr>
-              <w:pStyle w:val="Listaszerbekezds"/>
-              <w:numPr>
-                <w:ilvl w:val="0"/>
-                <w:numId w:val="5"/>
-              </w:numPr>
-            </w:pPr>
-            <w:r>
-              <w:t>Email (VARCHAR): A vevő email címe. Nem lehet kettő ugyanolyan email cím az adatbázisban.</w:t>
-            </w:r>
-          </w:p>
-          <w:p>
-            <w:pPr>
-              <w:pStyle w:val="Listaszerbekezds"/>
-              <w:numPr>
-                <w:ilvl w:val="0"/>
-                <w:numId w:val="5"/>
-              </w:numPr>
-            </w:pPr>
-            <w:r>
-              <w:t xml:space="preserve">Adószám (VARCHAR): Ha a vásárló egy cég </w:t>
-            </w:r>
-            <w:r>
-              <w:t>akkor itt táróljuk az adószámát.</w:t>
-            </w:r>
-          </w:p>
-          <w:p>
-            <w:pPr>
-              <w:pStyle w:val="Listaszerbekezds"/>
-              <w:numPr>
-                <w:ilvl w:val="0"/>
-                <w:numId w:val="5"/>
-              </w:numPr>
-            </w:pPr>
-            <w:r>
-              <w:t xml:space="preserve">jelszó (VARCHAR): A felhasználó </w:t>
-            </w:r>
-            <w:proofErr w:type="spellStart"/>
-            <w:r>
-              <w:t>jelszava</w:t>
-            </w:r>
-            <w:proofErr w:type="spellEnd"/>
-            <w:r>
-              <w:t xml:space="preserve"> </w:t>
-            </w:r>
-            <w:proofErr w:type="spellStart"/>
-            <w:r>
-              <w:t>elkódoltan</w:t>
-            </w:r>
-            <w:proofErr w:type="spellEnd"/>
-            <w:r>
-              <w:t xml:space="preserve">. </w:t>
-            </w:r>
-          </w:p>
-          <w:p>
-            <w:pPr>
-              <w:pStyle w:val="Listaszerbekezds"/>
-              <w:numPr>
-                <w:ilvl w:val="0"/>
-                <w:numId w:val="5"/>
-              </w:numPr>
-            </w:pPr>
-            <w:proofErr w:type="spellStart"/>
-            <w:r>
-              <w:t>jogosultsag</w:t>
-            </w:r>
-            <w:proofErr w:type="spellEnd"/>
-            <w:r>
-              <w:t xml:space="preserve"> (INT): Milyen jogosultsággal rendelkezik a felhasználó (</w:t>
-            </w:r>
-            <w:proofErr w:type="spellStart"/>
-            <w:r>
-              <w:t>Admin</w:t>
-            </w:r>
-            <w:proofErr w:type="spellEnd"/>
-            <w:r>
-              <w:t xml:space="preserve">, </w:t>
-            </w:r>
-            <w:proofErr w:type="spellStart"/>
-            <w:r>
-              <w:t>user</w:t>
-            </w:r>
-            <w:proofErr w:type="spellEnd"/>
-            <w:r>
-              <w:t>)</w:t>
-            </w:r>
+            </w:pPr>
           </w:p>
         </w:tc>
       </w:tr>
     </w:tbl>
     <w:p/>
     <w:p>
+      <w:pPr>
+        <w:rPr>
+          <w:noProof/>
+        </w:rPr>
+      </w:pPr>
       <w:r>
-        <w:t>1.17: Fizetési mód:</w:t>
+        <w:t>1.1</w:t>
+      </w:r>
+      <w:r>
+        <w:t>7</w:t>
+      </w:r>
+      <w:r>
+        <w:t xml:space="preserve">: </w:t>
+      </w:r>
+      <w:r>
+        <w:rPr>
+          <w:noProof/>
+        </w:rPr>
+        <w:t>Szállítás</w:t>
       </w:r>
     </w:p>
     <w:tbl>
@@ -3695,10 +3338,8 @@
           </w:tcPr>
           <w:p>
             <w:r>
-              <w:t>Fizetési mód:</w:t>
-            </w:r>
-            <w:bookmarkStart w:id="0" w:name="_GoBack"/>
-            <w:bookmarkEnd w:id="0"/>
+              <w:t>Szállítás:</w:t>
+            </w:r>
           </w:p>
         </w:tc>
         <w:tc>
@@ -3725,12 +3366,11 @@
               <w:rPr>
                 <w:noProof/>
               </w:rPr>
-              <w:lastRenderedPageBreak/>
               <w:drawing>
-                <wp:inline distT="0" distB="0" distL="0" distR="0" wp14:anchorId="2F744834" wp14:editId="55FAF45F">
-                  <wp:extent cx="1733792" cy="1533739"/>
-                  <wp:effectExtent l="0" t="0" r="0" b="9525"/>
-                  <wp:docPr id="20" name="Kép 20"/>
+                <wp:inline distT="0" distB="0" distL="0" distR="0" wp14:anchorId="179E66F8" wp14:editId="78ABDDDD">
+                  <wp:extent cx="2210108" cy="1066949"/>
+                  <wp:effectExtent l="0" t="0" r="0" b="0"/>
+                  <wp:docPr id="3" name="Kép 3"/>
                   <wp:cNvGraphicFramePr>
                     <a:graphicFrameLocks xmlns:a="http://schemas.openxmlformats.org/drawingml/2006/main" noChangeAspect="1"/>
                   </wp:cNvGraphicFramePr>
@@ -3750,7 +3390,7 @@
                         <pic:spPr>
                           <a:xfrm>
                             <a:off x="0" y="0"/>
-                            <a:ext cx="1733792" cy="1533739"/>
+                            <a:ext cx="2210108" cy="1066949"/>
                           </a:xfrm>
                           <a:prstGeom prst="rect">
                             <a:avLst/>
@@ -3770,7 +3410,7 @@
           </w:tcPr>
           <w:p>
             <w:r>
-              <w:t>Fizetési mód tábla:</w:t>
+              <w:t>Szállítás tábla:</w:t>
             </w:r>
           </w:p>
           <w:p>
@@ -3814,8 +3454,13 @@
                 <w:numId w:val="5"/>
               </w:numPr>
             </w:pPr>
-            <w:r>
-              <w:t>Fizetési név (VARCHAR): A fizetési mód neve (Kártya, utánvét stb.)</w:t>
+            <w:proofErr w:type="spellStart"/>
+            <w:r>
+              <w:t>szállítási_mód</w:t>
+            </w:r>
+            <w:proofErr w:type="spellEnd"/>
+            <w:r>
+              <w:t xml:space="preserve"> (VARCHAR): A szállítási mód neve (Házhoz szállítás, Személyes átvétel)</w:t>
             </w:r>
           </w:p>
           <w:p>
@@ -3826,6 +3471,7 @@
         </w:tc>
       </w:tr>
     </w:tbl>
+    <w:p/>
     <w:p/>
     <w:p>
       <w:pPr>
@@ -3834,13 +3480,26 @@
         </w:rPr>
       </w:pPr>
       <w:r>
-        <w:t xml:space="preserve">1.18: </w:t>
+        <w:lastRenderedPageBreak/>
+        <w:t>1.1</w:t>
+      </w:r>
+      <w:r>
+        <w:t>8</w:t>
+      </w:r>
+      <w:r>
+        <w:t xml:space="preserve">: </w:t>
       </w:r>
       <w:r>
         <w:rPr>
           <w:noProof/>
         </w:rPr>
-        <w:t>Szállítás</w:t>
+        <w:t>Rendelés státusz</w:t>
+      </w:r>
+      <w:r>
+        <w:rPr>
+          <w:noProof/>
+        </w:rPr>
+        <w:t>:</w:t>
       </w:r>
     </w:p>
     <w:tbl>
@@ -3859,8 +3518,19 @@
             <w:tcW w:w="4531" w:type="dxa"/>
           </w:tcPr>
           <w:p>
-            <w:r>
-              <w:t>Szállítás:</w:t>
+            <w:pPr>
+              <w:rPr>
+                <w:noProof/>
+              </w:rPr>
+            </w:pPr>
+            <w:r>
+              <w:rPr>
+                <w:noProof/>
+              </w:rPr>
+              <w:t>Rendelés státusz</w:t>
+            </w:r>
+            <w:r>
+              <w:t>:</w:t>
             </w:r>
           </w:p>
         </w:tc>
@@ -3886,10 +3556,10 @@
             </w:pPr>
             <w:r>
               <w:drawing>
-                <wp:inline distT="0" distB="0" distL="0" distR="0" wp14:anchorId="179E66F8" wp14:editId="78ABDDDD">
-                  <wp:extent cx="2210108" cy="1066949"/>
-                  <wp:effectExtent l="0" t="0" r="0" b="0"/>
-                  <wp:docPr id="3" name="Kép 3"/>
+                <wp:inline distT="0" distB="0" distL="0" distR="0" wp14:anchorId="62C88448" wp14:editId="7D5A590D">
+                  <wp:extent cx="1895740" cy="1124107"/>
+                  <wp:effectExtent l="0" t="0" r="9525" b="0"/>
+                  <wp:docPr id="14" name="Kép 14"/>
                   <wp:cNvGraphicFramePr>
                     <a:graphicFrameLocks xmlns:a="http://schemas.openxmlformats.org/drawingml/2006/main" noChangeAspect="1"/>
                   </wp:cNvGraphicFramePr>
@@ -3909,7 +3579,7 @@
                         <pic:spPr>
                           <a:xfrm>
                             <a:off x="0" y="0"/>
-                            <a:ext cx="2210108" cy="1066949"/>
+                            <a:ext cx="1895740" cy="1124107"/>
                           </a:xfrm>
                           <a:prstGeom prst="rect">
                             <a:avLst/>
@@ -3975,11 +3645,34 @@
             </w:pPr>
             <w:proofErr w:type="spellStart"/>
             <w:r>
-              <w:t>szállítási_mód</w:t>
-            </w:r>
-            <w:proofErr w:type="spellEnd"/>
-            <w:r>
-              <w:t xml:space="preserve"> (VARCHAR): A szállítási mód neve (Házhoz szállítás, Személyes átvétel)</w:t>
+              <w:t>statusz</w:t>
+            </w:r>
+            <w:proofErr w:type="spellEnd"/>
+            <w:r>
+              <w:t xml:space="preserve">(VARCHAR): A </w:t>
+            </w:r>
+            <w:r>
+              <w:t>rendelés státuszának</w:t>
+            </w:r>
+            <w:r>
+              <w:t xml:space="preserve"> neve (</w:t>
+            </w:r>
+            <w:proofErr w:type="spellStart"/>
+            <w:r>
+              <w:t>Pl</w:t>
+            </w:r>
+            <w:proofErr w:type="spellEnd"/>
+            <w:r>
+              <w:t>: Csomagolva</w:t>
+            </w:r>
+            <w:r>
+              <w:t xml:space="preserve">, </w:t>
+            </w:r>
+            <w:r>
+              <w:t xml:space="preserve">feladva </w:t>
+            </w:r>
+            <w:r>
+              <w:t>)</w:t>
             </w:r>
           </w:p>
           <w:p>
@@ -3990,6 +3683,236 @@
         </w:tc>
       </w:tr>
     </w:tbl>
+    <w:p/>
+    <w:p>
+      <w:r>
+        <w:t>1.19: Rendelés leadása:</w:t>
+      </w:r>
+    </w:p>
+    <w:tbl>
+      <w:tblPr>
+        <w:tblStyle w:val="Rcsostblzat"/>
+        <w:tblW w:w="0" w:type="auto"/>
+        <w:tblLook w:val="04A0" w:firstRow="1" w:lastRow="0" w:firstColumn="1" w:lastColumn="0" w:noHBand="0" w:noVBand="1"/>
+      </w:tblPr>
+      <w:tblGrid>
+        <w:gridCol w:w="4531"/>
+        <w:gridCol w:w="4531"/>
+      </w:tblGrid>
+      <w:tr>
+        <w:tc>
+          <w:tcPr>
+            <w:tcW w:w="4531" w:type="dxa"/>
+          </w:tcPr>
+          <w:p>
+            <w:pPr>
+              <w:rPr>
+                <w:noProof/>
+              </w:rPr>
+            </w:pPr>
+            <w:r>
+              <w:t>Rendelés leadása</w:t>
+            </w:r>
+            <w:r>
+              <w:rPr>
+                <w:noProof/>
+              </w:rPr>
+              <w:t xml:space="preserve"> státusz</w:t>
+            </w:r>
+            <w:r>
+              <w:t>:</w:t>
+            </w:r>
+          </w:p>
+        </w:tc>
+        <w:tc>
+          <w:tcPr>
+            <w:tcW w:w="4531" w:type="dxa"/>
+          </w:tcPr>
+          <w:p>
+            <w:r>
+              <w:t>Adatai:</w:t>
+            </w:r>
+          </w:p>
+        </w:tc>
+      </w:tr>
+      <w:tr>
+        <w:tc>
+          <w:tcPr>
+            <w:tcW w:w="4531" w:type="dxa"/>
+          </w:tcPr>
+          <w:p>
+            <w:pPr>
+              <w:jc w:val="center"/>
+            </w:pPr>
+            <w:r>
+              <w:drawing>
+                <wp:inline distT="0" distB="0" distL="0" distR="0" wp14:anchorId="6D3AC041" wp14:editId="6B27A5CE">
+                  <wp:extent cx="2114845" cy="2524477"/>
+                  <wp:effectExtent l="0" t="0" r="0" b="9525"/>
+                  <wp:docPr id="24" name="Kép 24"/>
+                  <wp:cNvGraphicFramePr>
+                    <a:graphicFrameLocks xmlns:a="http://schemas.openxmlformats.org/drawingml/2006/main" noChangeAspect="1"/>
+                  </wp:cNvGraphicFramePr>
+                  <a:graphic xmlns:a="http://schemas.openxmlformats.org/drawingml/2006/main">
+                    <a:graphicData uri="http://schemas.openxmlformats.org/drawingml/2006/picture">
+                      <pic:pic xmlns:pic="http://schemas.openxmlformats.org/drawingml/2006/picture">
+                        <pic:nvPicPr>
+                          <pic:cNvPr id="1" name=""/>
+                          <pic:cNvPicPr/>
+                        </pic:nvPicPr>
+                        <pic:blipFill>
+                          <a:blip r:embed="rId26"/>
+                          <a:stretch>
+                            <a:fillRect/>
+                          </a:stretch>
+                        </pic:blipFill>
+                        <pic:spPr>
+                          <a:xfrm>
+                            <a:off x="0" y="0"/>
+                            <a:ext cx="2114845" cy="2524477"/>
+                          </a:xfrm>
+                          <a:prstGeom prst="rect">
+                            <a:avLst/>
+                          </a:prstGeom>
+                        </pic:spPr>
+                      </pic:pic>
+                    </a:graphicData>
+                  </a:graphic>
+                </wp:inline>
+              </w:drawing>
+            </w:r>
+          </w:p>
+        </w:tc>
+        <w:tc>
+          <w:tcPr>
+            <w:tcW w:w="4531" w:type="dxa"/>
+          </w:tcPr>
+          <w:p>
+            <w:r>
+              <w:t>Szállítás tábla:</w:t>
+            </w:r>
+          </w:p>
+          <w:p>
+            <w:pPr>
+              <w:pStyle w:val="Listaszerbekezds"/>
+              <w:numPr>
+                <w:ilvl w:val="0"/>
+                <w:numId w:val="5"/>
+              </w:numPr>
+            </w:pPr>
+            <w:proofErr w:type="spellStart"/>
+            <w:r>
+              <w:t>id</w:t>
+            </w:r>
+            <w:proofErr w:type="spellEnd"/>
+            <w:r>
+              <w:t xml:space="preserve"> (INT): egyedi azonosító </w:t>
+            </w:r>
+            <w:proofErr w:type="spellStart"/>
+            <w:r>
+              <w:t>Auto</w:t>
+            </w:r>
+            <w:proofErr w:type="spellEnd"/>
+            <w:r>
+              <w:t xml:space="preserve"> </w:t>
+            </w:r>
+            <w:proofErr w:type="spellStart"/>
+            <w:r>
+              <w:t>incrementel</w:t>
+            </w:r>
+            <w:proofErr w:type="spellEnd"/>
+            <w:r>
+              <w:t xml:space="preserve"> növekszik.</w:t>
+            </w:r>
+          </w:p>
+          <w:p>
+            <w:pPr>
+              <w:pStyle w:val="Listaszerbekezds"/>
+              <w:numPr>
+                <w:ilvl w:val="0"/>
+                <w:numId w:val="5"/>
+              </w:numPr>
+            </w:pPr>
+            <w:r>
+              <w:t xml:space="preserve">cím </w:t>
+            </w:r>
+            <w:r>
+              <w:t xml:space="preserve">(VARCHAR): </w:t>
+            </w:r>
+            <w:r>
+              <w:t>A rendelt könyv címe.</w:t>
+            </w:r>
+          </w:p>
+          <w:p>
+            <w:pPr>
+              <w:pStyle w:val="Listaszerbekezds"/>
+              <w:numPr>
+                <w:ilvl w:val="0"/>
+                <w:numId w:val="5"/>
+              </w:numPr>
+            </w:pPr>
+            <w:proofErr w:type="spellStart"/>
+            <w:r>
+              <w:t>egysegar</w:t>
+            </w:r>
+            <w:proofErr w:type="spellEnd"/>
+            <w:r>
+              <w:t xml:space="preserve"> (INT) : A könyv ára a számla felvételének időpontjában. </w:t>
+            </w:r>
+          </w:p>
+          <w:p>
+            <w:pPr>
+              <w:pStyle w:val="Listaszerbekezds"/>
+              <w:numPr>
+                <w:ilvl w:val="0"/>
+                <w:numId w:val="5"/>
+              </w:numPr>
+            </w:pPr>
+            <w:r>
+              <w:t xml:space="preserve">ISBN (BIGINT): A könyv ISBN-je. </w:t>
+            </w:r>
+          </w:p>
+          <w:p>
+            <w:pPr>
+              <w:pStyle w:val="Listaszerbekezds"/>
+              <w:numPr>
+                <w:ilvl w:val="0"/>
+                <w:numId w:val="5"/>
+              </w:numPr>
+            </w:pPr>
+            <w:proofErr w:type="spellStart"/>
+            <w:r>
+              <w:t>szamla_id</w:t>
+            </w:r>
+            <w:proofErr w:type="spellEnd"/>
+            <w:r>
+              <w:t xml:space="preserve"> (INT): A kapcsolódó számlának az </w:t>
+            </w:r>
+            <w:proofErr w:type="spellStart"/>
+            <w:r>
+              <w:t>id</w:t>
+            </w:r>
+            <w:proofErr w:type="spellEnd"/>
+            <w:r>
+              <w:t>-je</w:t>
+            </w:r>
+          </w:p>
+          <w:p>
+            <w:pPr>
+              <w:pStyle w:val="Listaszerbekezds"/>
+              <w:numPr>
+                <w:ilvl w:val="0"/>
+                <w:numId w:val="5"/>
+              </w:numPr>
+            </w:pPr>
+            <w:r>
+              <w:t>darab (INT): A rendelt könyvből hány darabot vásárolt a vevő.</w:t>
+            </w:r>
+          </w:p>
+        </w:tc>
+      </w:tr>
+    </w:tbl>
+    <w:p/>
     <w:p/>
     <w:p>
       <w:r>
@@ -4715,6 +4638,7 @@
                 <w:rStyle w:val="HTML-kd"/>
                 <w:rFonts w:eastAsiaTheme="minorHAnsi"/>
               </w:rPr>
+              <w:lastRenderedPageBreak/>
               <w:t>/</w:t>
             </w:r>
             <w:proofErr w:type="spellStart"/>
@@ -5033,7 +4957,6 @@
                 <w:b/>
                 <w:bCs/>
               </w:rPr>
-              <w:lastRenderedPageBreak/>
               <w:t>Végpont</w:t>
             </w:r>
           </w:p>
@@ -5276,7 +5199,7 @@
                 <w:bCs/>
               </w:rPr>
             </w:pPr>
-            <w:bookmarkStart w:id="1" w:name="_Hlk220063673"/>
+            <w:bookmarkStart w:id="0" w:name="_Hlk220063673"/>
             <w:r>
               <w:rPr>
                 <w:b/>
@@ -5581,7 +5504,7 @@
           </w:p>
         </w:tc>
       </w:tr>
-      <w:bookmarkEnd w:id="1"/>
+      <w:bookmarkEnd w:id="0"/>
     </w:tbl>
     <w:p/>
     <w:p>
@@ -5594,6 +5517,10 @@
         <w:tblW w:w="0" w:type="auto"/>
         <w:tblCellSpacing w:w="15" w:type="dxa"/>
         <w:tblBorders>
+          <w:top w:val="single" w:sz="4" w:space="0" w:color="auto"/>
+          <w:left w:val="single" w:sz="4" w:space="0" w:color="auto"/>
+          <w:bottom w:val="single" w:sz="4" w:space="0" w:color="auto"/>
+          <w:right w:val="single" w:sz="4" w:space="0" w:color="auto"/>
           <w:insideH w:val="single" w:sz="4" w:space="0" w:color="auto"/>
           <w:insideV w:val="single" w:sz="4" w:space="0" w:color="auto"/>
         </w:tblBorders>
@@ -5606,11 +5533,11 @@
         <w:tblLook w:val="04A0" w:firstRow="1" w:lastRow="0" w:firstColumn="1" w:lastColumn="0" w:noHBand="0" w:noVBand="1"/>
       </w:tblPr>
       <w:tblGrid>
-        <w:gridCol w:w="2390"/>
-        <w:gridCol w:w="873"/>
-        <w:gridCol w:w="3177"/>
-        <w:gridCol w:w="909"/>
-        <w:gridCol w:w="1594"/>
+        <w:gridCol w:w="2856"/>
+        <w:gridCol w:w="814"/>
+        <w:gridCol w:w="1712"/>
+        <w:gridCol w:w="1239"/>
+        <w:gridCol w:w="2441"/>
       </w:tblGrid>
       <w:tr>
         <w:trPr>
@@ -5654,13 +5581,15 @@
                 <w:bCs/>
               </w:rPr>
             </w:pPr>
+            <w:proofErr w:type="spellStart"/>
             <w:r>
               <w:rPr>
                 <w:b/>
                 <w:bCs/>
               </w:rPr>
-              <w:t>Módszer</w:t>
-            </w:r>
+              <w:t>Method</w:t>
+            </w:r>
+            <w:proofErr w:type="spellEnd"/>
           </w:p>
         </w:tc>
         <w:tc>
@@ -5767,6 +5696,13 @@
               </w:rPr>
               <w:t>/</w:t>
             </w:r>
+            <w:r>
+              <w:rPr>
+                <w:rStyle w:val="HTML-kd"/>
+                <w:rFonts w:eastAsiaTheme="minorHAnsi"/>
+              </w:rPr>
+              <w:t>?</w:t>
+            </w:r>
             <w:proofErr w:type="spellStart"/>
             <w:r>
               <w:rPr>
@@ -5798,31 +5734,157 @@
           </w:tcPr>
           <w:p>
             <w:r>
-              <w:t>-</w:t>
-            </w:r>
-          </w:p>
-        </w:tc>
-        <w:tc>
-          <w:tcPr>
-            <w:tcW w:w="0" w:type="auto"/>
-            <w:vAlign w:val="center"/>
-            <w:hideMark/>
-          </w:tcPr>
-          <w:p>
-            <w:r>
-              <w:t>email</w:t>
-            </w:r>
-          </w:p>
-        </w:tc>
-        <w:tc>
-          <w:tcPr>
-            <w:tcW w:w="0" w:type="auto"/>
-            <w:vAlign w:val="center"/>
-            <w:hideMark/>
-          </w:tcPr>
-          <w:p>
-            <w:r>
-              <w:t>Előző rendelések</w:t>
+              <w:t>K</w:t>
+            </w:r>
+            <w:r>
+              <w:t>eresést végez a szerző neve vagy a könyv neve alapján.</w:t>
+            </w:r>
+          </w:p>
+        </w:tc>
+        <w:tc>
+          <w:tcPr>
+            <w:tcW w:w="0" w:type="auto"/>
+            <w:vAlign w:val="center"/>
+            <w:hideMark/>
+          </w:tcPr>
+          <w:p>
+            <w:r>
+              <w:t>Szerző név/Könyv név</w:t>
+            </w:r>
+          </w:p>
+        </w:tc>
+        <w:tc>
+          <w:tcPr>
+            <w:tcW w:w="0" w:type="auto"/>
+            <w:vAlign w:val="center"/>
+            <w:hideMark/>
+          </w:tcPr>
+          <w:p>
+            <w:r>
+              <w:t>Könyvek ezzel</w:t>
+            </w:r>
+            <w:r>
+              <w:t xml:space="preserve"> </w:t>
+            </w:r>
+            <w:r>
+              <w:t xml:space="preserve">a címmel vagy </w:t>
+            </w:r>
+            <w:r>
+              <w:t>szerző név</w:t>
+            </w:r>
+            <w:r>
+              <w:t>vel</w:t>
+            </w:r>
+            <w:r>
+              <w:t xml:space="preserve"> amiben található a bemenet</w:t>
+            </w:r>
+            <w:r>
+              <w:t>ben.</w:t>
+            </w:r>
+          </w:p>
+        </w:tc>
+      </w:tr>
+      <w:tr>
+        <w:trPr>
+          <w:trHeight w:val="911"/>
+          <w:tblCellSpacing w:w="15" w:type="dxa"/>
+        </w:trPr>
+        <w:tc>
+          <w:tcPr>
+            <w:tcW w:w="0" w:type="auto"/>
+            <w:vAlign w:val="center"/>
+          </w:tcPr>
+          <w:p>
+            <w:pPr>
+              <w:rPr>
+                <w:rStyle w:val="HTML-kd"/>
+                <w:rFonts w:eastAsiaTheme="minorHAnsi"/>
+              </w:rPr>
+            </w:pPr>
+            <w:r>
+              <w:rPr>
+                <w:rStyle w:val="HTML-kd"/>
+                <w:rFonts w:eastAsiaTheme="minorHAnsi"/>
+              </w:rPr>
+              <w:t>/</w:t>
+            </w:r>
+            <w:proofErr w:type="spellStart"/>
+            <w:r>
+              <w:rPr>
+                <w:rStyle w:val="HTML-kd"/>
+                <w:rFonts w:eastAsiaTheme="minorHAnsi"/>
+              </w:rPr>
+              <w:t>konyvek</w:t>
+            </w:r>
+            <w:proofErr w:type="spellEnd"/>
+            <w:r>
+              <w:rPr>
+                <w:rStyle w:val="HTML-kd"/>
+                <w:rFonts w:eastAsiaTheme="minorHAnsi"/>
+              </w:rPr>
+              <w:t>/?</w:t>
+            </w:r>
+            <w:proofErr w:type="spellStart"/>
+            <w:r>
+              <w:rPr>
+                <w:rStyle w:val="HTML-kd"/>
+                <w:rFonts w:eastAsiaTheme="minorHAnsi"/>
+              </w:rPr>
+              <w:t>search%kiado</w:t>
+            </w:r>
+            <w:proofErr w:type="spellEnd"/>
+          </w:p>
+        </w:tc>
+        <w:tc>
+          <w:tcPr>
+            <w:tcW w:w="0" w:type="auto"/>
+            <w:vAlign w:val="center"/>
+          </w:tcPr>
+          <w:p>
+            <w:r>
+              <w:t>GET</w:t>
+            </w:r>
+          </w:p>
+        </w:tc>
+        <w:tc>
+          <w:tcPr>
+            <w:tcW w:w="0" w:type="auto"/>
+            <w:vAlign w:val="center"/>
+          </w:tcPr>
+          <w:p>
+            <w:r>
+              <w:t>K</w:t>
+            </w:r>
+            <w:r>
+              <w:t xml:space="preserve">eresést végez a </w:t>
+            </w:r>
+            <w:r>
+              <w:t>kiadó</w:t>
+            </w:r>
+            <w:r>
+              <w:t xml:space="preserve"> neve alapján.</w:t>
+            </w:r>
+          </w:p>
+        </w:tc>
+        <w:tc>
+          <w:tcPr>
+            <w:tcW w:w="0" w:type="auto"/>
+            <w:vAlign w:val="center"/>
+          </w:tcPr>
+          <w:p>
+            <w:r>
+              <w:t>Kiadó név</w:t>
+            </w:r>
+          </w:p>
+        </w:tc>
+        <w:tc>
+          <w:tcPr>
+            <w:tcW w:w="0" w:type="auto"/>
+            <w:vAlign w:val="center"/>
+          </w:tcPr>
+          <w:p>
+            <w:r>
+              <w:t>Könyvek ezzel a kiadóval.</w:t>
             </w:r>
           </w:p>
         </w:tc>
@@ -5844,24 +5906,44 @@
               </w:rPr>
             </w:pPr>
             <w:r>
+              <w:rPr>
+                <w:rStyle w:val="HTML-kd"/>
+                <w:rFonts w:eastAsiaTheme="minorHAnsi"/>
+              </w:rPr>
               <w:t>/</w:t>
             </w:r>
             <w:proofErr w:type="spellStart"/>
             <w:r>
+              <w:rPr>
+                <w:rStyle w:val="HTML-kd"/>
+                <w:rFonts w:eastAsiaTheme="minorHAnsi"/>
+              </w:rPr>
               <w:t>konyvek</w:t>
             </w:r>
             <w:proofErr w:type="spellEnd"/>
             <w:r>
-              <w:t>/</w:t>
-            </w:r>
-            <w:proofErr w:type="spellStart"/>
-            <w:r>
-              <w:t>search?szerz</w:t>
-            </w:r>
-            <w:proofErr w:type="spellEnd"/>
-            <w:r>
-              <w:t>=’’</w:t>
-            </w:r>
+              <w:rPr>
+                <w:rStyle w:val="HTML-kd"/>
+                <w:rFonts w:eastAsiaTheme="minorHAnsi"/>
+              </w:rPr>
+              <w:t>/?</w:t>
+            </w:r>
+            <w:proofErr w:type="spellStart"/>
+            <w:r>
+              <w:rPr>
+                <w:rStyle w:val="HTML-kd"/>
+                <w:rFonts w:eastAsiaTheme="minorHAnsi"/>
+              </w:rPr>
+              <w:t>search%</w:t>
+            </w:r>
+            <w:r>
+              <w:rPr>
+                <w:rStyle w:val="HTML-kd"/>
+                <w:rFonts w:eastAsiaTheme="minorHAnsi"/>
+              </w:rPr>
+              <w:t>nyelv</w:t>
+            </w:r>
+            <w:proofErr w:type="spellEnd"/>
           </w:p>
         </w:tc>
         <w:tc>
@@ -5882,23 +5964,37 @@
           </w:tcPr>
           <w:p>
             <w:r>
-              <w:t xml:space="preserve">Az illusztrátorok neve alapján szűr. </w:t>
-            </w:r>
-          </w:p>
-        </w:tc>
-        <w:tc>
-          <w:tcPr>
-            <w:tcW w:w="0" w:type="auto"/>
-            <w:vAlign w:val="center"/>
-          </w:tcPr>
-          <w:p/>
-        </w:tc>
-        <w:tc>
-          <w:tcPr>
-            <w:tcW w:w="0" w:type="auto"/>
-            <w:vAlign w:val="center"/>
-          </w:tcPr>
-          <w:p/>
+              <w:t xml:space="preserve">Keresést végez a </w:t>
+            </w:r>
+            <w:r>
+              <w:t>nyelv</w:t>
+            </w:r>
+            <w:r>
+              <w:t xml:space="preserve"> alapján.</w:t>
+            </w:r>
+          </w:p>
+        </w:tc>
+        <w:tc>
+          <w:tcPr>
+            <w:tcW w:w="0" w:type="auto"/>
+            <w:vAlign w:val="center"/>
+          </w:tcPr>
+          <w:p>
+            <w:r>
+              <w:t>Nyelv név</w:t>
+            </w:r>
+          </w:p>
+        </w:tc>
+        <w:tc>
+          <w:tcPr>
+            <w:tcW w:w="0" w:type="auto"/>
+            <w:vAlign w:val="center"/>
+          </w:tcPr>
+          <w:p>
+            <w:r>
+              <w:t>Könyvek ezen a nyelven.</w:t>
+            </w:r>
+          </w:p>
         </w:tc>
       </w:tr>
       <w:tr>
@@ -5918,24 +6014,44 @@
               </w:rPr>
             </w:pPr>
             <w:r>
+              <w:rPr>
+                <w:rStyle w:val="HTML-kd"/>
+                <w:rFonts w:eastAsiaTheme="minorHAnsi"/>
+              </w:rPr>
               <w:t>/</w:t>
             </w:r>
             <w:proofErr w:type="spellStart"/>
             <w:r>
+              <w:rPr>
+                <w:rStyle w:val="HTML-kd"/>
+                <w:rFonts w:eastAsiaTheme="minorHAnsi"/>
+              </w:rPr>
               <w:t>konyvek</w:t>
             </w:r>
             <w:proofErr w:type="spellEnd"/>
             <w:r>
-              <w:t>/</w:t>
-            </w:r>
-            <w:proofErr w:type="spellStart"/>
-            <w:r>
-              <w:t>search?illusz</w:t>
-            </w:r>
-            <w:proofErr w:type="spellEnd"/>
-            <w:r>
-              <w:t>=’’</w:t>
-            </w:r>
+              <w:rPr>
+                <w:rStyle w:val="HTML-kd"/>
+                <w:rFonts w:eastAsiaTheme="minorHAnsi"/>
+              </w:rPr>
+              <w:t>/?</w:t>
+            </w:r>
+            <w:proofErr w:type="spellStart"/>
+            <w:r>
+              <w:rPr>
+                <w:rStyle w:val="HTML-kd"/>
+                <w:rFonts w:eastAsiaTheme="minorHAnsi"/>
+              </w:rPr>
+              <w:t>search%</w:t>
+            </w:r>
+            <w:r>
+              <w:rPr>
+                <w:rStyle w:val="HTML-kd"/>
+                <w:rFonts w:eastAsiaTheme="minorHAnsi"/>
+              </w:rPr>
+              <w:t>borito</w:t>
+            </w:r>
+            <w:proofErr w:type="spellEnd"/>
           </w:p>
         </w:tc>
         <w:tc>
@@ -5956,23 +6072,37 @@
           </w:tcPr>
           <w:p>
             <w:r>
-              <w:t xml:space="preserve">Az illusztrátorok neve alapján szűr. </w:t>
-            </w:r>
-          </w:p>
-        </w:tc>
-        <w:tc>
-          <w:tcPr>
-            <w:tcW w:w="0" w:type="auto"/>
-            <w:vAlign w:val="center"/>
-          </w:tcPr>
-          <w:p/>
-        </w:tc>
-        <w:tc>
-          <w:tcPr>
-            <w:tcW w:w="0" w:type="auto"/>
-            <w:vAlign w:val="center"/>
-          </w:tcPr>
-          <w:p/>
+              <w:t xml:space="preserve">Keresést végez a </w:t>
+            </w:r>
+            <w:r>
+              <w:t xml:space="preserve">borító </w:t>
+            </w:r>
+            <w:r>
+              <w:t>alapján.</w:t>
+            </w:r>
+          </w:p>
+        </w:tc>
+        <w:tc>
+          <w:tcPr>
+            <w:tcW w:w="0" w:type="auto"/>
+            <w:vAlign w:val="center"/>
+          </w:tcPr>
+          <w:p>
+            <w:r>
+              <w:t>Kiadó név</w:t>
+            </w:r>
+          </w:p>
+        </w:tc>
+        <w:tc>
+          <w:tcPr>
+            <w:tcW w:w="0" w:type="auto"/>
+            <w:vAlign w:val="center"/>
+          </w:tcPr>
+          <w:p>
+            <w:r>
+              <w:t>Könyvek ezzel a borítóval.</w:t>
+            </w:r>
+          </w:p>
         </w:tc>
       </w:tr>
       <w:tr>
@@ -5992,24 +6122,44 @@
               </w:rPr>
             </w:pPr>
             <w:r>
+              <w:rPr>
+                <w:rStyle w:val="HTML-kd"/>
+                <w:rFonts w:eastAsiaTheme="minorHAnsi"/>
+              </w:rPr>
               <w:t>/</w:t>
             </w:r>
             <w:proofErr w:type="spellStart"/>
             <w:r>
+              <w:rPr>
+                <w:rStyle w:val="HTML-kd"/>
+                <w:rFonts w:eastAsiaTheme="minorHAnsi"/>
+              </w:rPr>
               <w:t>konyvek</w:t>
             </w:r>
             <w:proofErr w:type="spellEnd"/>
             <w:r>
-              <w:t>/</w:t>
-            </w:r>
-            <w:proofErr w:type="spellStart"/>
-            <w:r>
-              <w:t>search?nyelv</w:t>
-            </w:r>
-            <w:proofErr w:type="spellEnd"/>
-            <w:r>
-              <w:t>=’’</w:t>
-            </w:r>
+              <w:rPr>
+                <w:rStyle w:val="HTML-kd"/>
+                <w:rFonts w:eastAsiaTheme="minorHAnsi"/>
+              </w:rPr>
+              <w:t>/?</w:t>
+            </w:r>
+            <w:proofErr w:type="spellStart"/>
+            <w:r>
+              <w:rPr>
+                <w:rStyle w:val="HTML-kd"/>
+                <w:rFonts w:eastAsiaTheme="minorHAnsi"/>
+              </w:rPr>
+              <w:t>search%</w:t>
+            </w:r>
+            <w:r>
+              <w:rPr>
+                <w:rStyle w:val="HTML-kd"/>
+                <w:rFonts w:eastAsiaTheme="minorHAnsi"/>
+              </w:rPr>
+              <w:t>tipus</w:t>
+            </w:r>
+            <w:proofErr w:type="spellEnd"/>
           </w:p>
         </w:tc>
         <w:tc>
@@ -6030,23 +6180,216 @@
           </w:tcPr>
           <w:p>
             <w:r>
-              <w:t>A nyelv alapján szűr.</w:t>
-            </w:r>
-          </w:p>
-        </w:tc>
-        <w:tc>
-          <w:tcPr>
-            <w:tcW w:w="0" w:type="auto"/>
-            <w:vAlign w:val="center"/>
-          </w:tcPr>
-          <w:p/>
-        </w:tc>
-        <w:tc>
-          <w:tcPr>
-            <w:tcW w:w="0" w:type="auto"/>
-            <w:vAlign w:val="center"/>
-          </w:tcPr>
-          <w:p/>
+              <w:t>Keresést végez a könyv típusa alapján.</w:t>
+            </w:r>
+          </w:p>
+        </w:tc>
+        <w:tc>
+          <w:tcPr>
+            <w:tcW w:w="0" w:type="auto"/>
+            <w:vAlign w:val="center"/>
+          </w:tcPr>
+          <w:p>
+            <w:r>
+              <w:t>Típus neve.</w:t>
+            </w:r>
+          </w:p>
+        </w:tc>
+        <w:tc>
+          <w:tcPr>
+            <w:tcW w:w="0" w:type="auto"/>
+            <w:vAlign w:val="center"/>
+          </w:tcPr>
+          <w:p>
+            <w:r>
+              <w:t>Az ilyen típusú könyvek.</w:t>
+            </w:r>
+          </w:p>
+        </w:tc>
+      </w:tr>
+    </w:tbl>
+    <w:p/>
+    <w:p>
+      <w:pPr>
+        <w:rPr>
+          <w:noProof/>
+        </w:rPr>
+      </w:pPr>
+      <w:r>
+        <w:rPr>
+          <w:noProof/>
+        </w:rPr>
+        <w:lastRenderedPageBreak/>
+        <w:br/>
+      </w:r>
+      <w:r>
+        <w:rPr>
+          <w:noProof/>
+        </w:rPr>
+        <w:t>Az oldal admin felülethez tartozó backend végpontjai</w:t>
+      </w:r>
+      <w:r>
+        <w:rPr>
+          <w:noProof/>
+        </w:rPr>
+        <w:t xml:space="preserve"> (Raktár)</w:t>
+      </w:r>
+      <w:r>
+        <w:rPr>
+          <w:noProof/>
+        </w:rPr>
+        <w:t>.</w:t>
+      </w:r>
+    </w:p>
+    <w:tbl>
+      <w:tblPr>
+        <w:tblW w:w="0" w:type="auto"/>
+        <w:tblCellSpacing w:w="15" w:type="dxa"/>
+        <w:tblBorders>
+          <w:top w:val="single" w:sz="4" w:space="0" w:color="auto"/>
+          <w:left w:val="single" w:sz="4" w:space="0" w:color="auto"/>
+          <w:bottom w:val="single" w:sz="4" w:space="0" w:color="auto"/>
+          <w:right w:val="single" w:sz="4" w:space="0" w:color="auto"/>
+          <w:insideH w:val="single" w:sz="4" w:space="0" w:color="auto"/>
+          <w:insideV w:val="single" w:sz="4" w:space="0" w:color="auto"/>
+        </w:tblBorders>
+        <w:tblLayout w:type="fixed"/>
+        <w:tblCellMar>
+          <w:top w:w="15" w:type="dxa"/>
+          <w:left w:w="15" w:type="dxa"/>
+          <w:bottom w:w="15" w:type="dxa"/>
+          <w:right w:w="15" w:type="dxa"/>
+        </w:tblCellMar>
+        <w:tblLook w:val="04A0" w:firstRow="1" w:lastRow="0" w:firstColumn="1" w:lastColumn="0" w:noHBand="0" w:noVBand="1"/>
+      </w:tblPr>
+      <w:tblGrid>
+        <w:gridCol w:w="3114"/>
+        <w:gridCol w:w="850"/>
+        <w:gridCol w:w="1853"/>
+        <w:gridCol w:w="1408"/>
+        <w:gridCol w:w="1837"/>
+      </w:tblGrid>
+      <w:tr>
+        <w:trPr>
+          <w:tblHeader/>
+          <w:tblCellSpacing w:w="15" w:type="dxa"/>
+        </w:trPr>
+        <w:tc>
+          <w:tcPr>
+            <w:tcW w:w="3069" w:type="dxa"/>
+            <w:vAlign w:val="center"/>
+            <w:hideMark/>
+          </w:tcPr>
+          <w:p>
+            <w:pPr>
+              <w:jc w:val="center"/>
+              <w:rPr>
+                <w:b/>
+                <w:bCs/>
+              </w:rPr>
+            </w:pPr>
+            <w:r>
+              <w:rPr>
+                <w:b/>
+                <w:bCs/>
+              </w:rPr>
+              <w:t>Végpont</w:t>
+            </w:r>
+          </w:p>
+        </w:tc>
+        <w:tc>
+          <w:tcPr>
+            <w:tcW w:w="820" w:type="dxa"/>
+            <w:vAlign w:val="center"/>
+            <w:hideMark/>
+          </w:tcPr>
+          <w:p>
+            <w:pPr>
+              <w:jc w:val="center"/>
+              <w:rPr>
+                <w:b/>
+                <w:bCs/>
+              </w:rPr>
+            </w:pPr>
+            <w:proofErr w:type="spellStart"/>
+            <w:r>
+              <w:rPr>
+                <w:b/>
+                <w:bCs/>
+              </w:rPr>
+              <w:t>Method</w:t>
+            </w:r>
+            <w:proofErr w:type="spellEnd"/>
+          </w:p>
+        </w:tc>
+        <w:tc>
+          <w:tcPr>
+            <w:tcW w:w="1823" w:type="dxa"/>
+            <w:vAlign w:val="center"/>
+            <w:hideMark/>
+          </w:tcPr>
+          <w:p>
+            <w:pPr>
+              <w:jc w:val="center"/>
+              <w:rPr>
+                <w:b/>
+                <w:bCs/>
+              </w:rPr>
+            </w:pPr>
+            <w:r>
+              <w:rPr>
+                <w:b/>
+                <w:bCs/>
+              </w:rPr>
+              <w:t>Leírás</w:t>
+            </w:r>
+          </w:p>
+        </w:tc>
+        <w:tc>
+          <w:tcPr>
+            <w:tcW w:w="1378" w:type="dxa"/>
+            <w:vAlign w:val="center"/>
+            <w:hideMark/>
+          </w:tcPr>
+          <w:p>
+            <w:pPr>
+              <w:jc w:val="center"/>
+              <w:rPr>
+                <w:b/>
+                <w:bCs/>
+              </w:rPr>
+            </w:pPr>
+            <w:r>
+              <w:rPr>
+                <w:b/>
+                <w:bCs/>
+              </w:rPr>
+              <w:t>Bemenet</w:t>
+            </w:r>
+          </w:p>
+        </w:tc>
+        <w:tc>
+          <w:tcPr>
+            <w:tcW w:w="1792" w:type="dxa"/>
+            <w:vAlign w:val="center"/>
+            <w:hideMark/>
+          </w:tcPr>
+          <w:p>
+            <w:pPr>
+              <w:jc w:val="center"/>
+              <w:rPr>
+                <w:b/>
+                <w:bCs/>
+              </w:rPr>
+            </w:pPr>
+            <w:r>
+              <w:rPr>
+                <w:b/>
+                <w:bCs/>
+              </w:rPr>
+              <w:t>Kimenet</w:t>
+            </w:r>
+          </w:p>
         </w:tc>
       </w:tr>
       <w:tr>
@@ -6055,41 +6398,50 @@
         </w:trPr>
         <w:tc>
           <w:tcPr>
-            <w:tcW w:w="0" w:type="auto"/>
-            <w:vAlign w:val="center"/>
-          </w:tcPr>
-          <w:p>
-            <w:pPr>
-              <w:rPr>
-                <w:rStyle w:val="HTML-kd"/>
-                <w:rFonts w:eastAsiaTheme="minorHAnsi"/>
-              </w:rPr>
-            </w:pPr>
-            <w:r>
+            <w:tcW w:w="3069" w:type="dxa"/>
+            <w:vAlign w:val="center"/>
+            <w:hideMark/>
+          </w:tcPr>
+          <w:p>
+            <w:r>
+              <w:rPr>
+                <w:rStyle w:val="HTML-kd"/>
+                <w:rFonts w:eastAsiaTheme="minorHAnsi"/>
+              </w:rPr>
               <w:t>/</w:t>
             </w:r>
             <w:proofErr w:type="spellStart"/>
             <w:r>
+              <w:rPr>
+                <w:rStyle w:val="HTML-kd"/>
+                <w:rFonts w:eastAsiaTheme="minorHAnsi"/>
+              </w:rPr>
               <w:t>konyvek</w:t>
             </w:r>
             <w:proofErr w:type="spellEnd"/>
             <w:r>
+              <w:rPr>
+                <w:rStyle w:val="HTML-kd"/>
+                <w:rFonts w:eastAsiaTheme="minorHAnsi"/>
+              </w:rPr>
               <w:t>/</w:t>
             </w:r>
             <w:proofErr w:type="spellStart"/>
             <w:r>
-              <w:t>search?kat</w:t>
-            </w:r>
-            <w:proofErr w:type="spellEnd"/>
-            <w:r>
-              <w:t>=’’</w:t>
-            </w:r>
-          </w:p>
-        </w:tc>
-        <w:tc>
-          <w:tcPr>
-            <w:tcW w:w="0" w:type="auto"/>
-            <w:vAlign w:val="center"/>
+              <w:rPr>
+                <w:rStyle w:val="HTML-kd"/>
+                <w:rFonts w:eastAsiaTheme="minorHAnsi"/>
+              </w:rPr>
+              <w:t>adminmodosit</w:t>
+            </w:r>
+            <w:proofErr w:type="spellEnd"/>
+          </w:p>
+        </w:tc>
+        <w:tc>
+          <w:tcPr>
+            <w:tcW w:w="820" w:type="dxa"/>
+            <w:vAlign w:val="center"/>
+            <w:hideMark/>
           </w:tcPr>
           <w:p>
             <w:r>
@@ -6099,28 +6451,150 @@
         </w:tc>
         <w:tc>
           <w:tcPr>
-            <w:tcW w:w="0" w:type="auto"/>
-            <w:vAlign w:val="center"/>
-          </w:tcPr>
-          <w:p>
-            <w:r>
-              <w:t xml:space="preserve">A kategóriák alapján szűr. </w:t>
-            </w:r>
-          </w:p>
-        </w:tc>
-        <w:tc>
-          <w:tcPr>
-            <w:tcW w:w="0" w:type="auto"/>
-            <w:vAlign w:val="center"/>
-          </w:tcPr>
-          <w:p/>
-        </w:tc>
-        <w:tc>
-          <w:tcPr>
-            <w:tcW w:w="0" w:type="auto"/>
-            <w:vAlign w:val="center"/>
-          </w:tcPr>
-          <w:p/>
+            <w:tcW w:w="1823" w:type="dxa"/>
+            <w:vAlign w:val="center"/>
+            <w:hideMark/>
+          </w:tcPr>
+          <w:p>
+            <w:r>
+              <w:t>Az összes rendelést kiadja.</w:t>
+            </w:r>
+          </w:p>
+        </w:tc>
+        <w:tc>
+          <w:tcPr>
+            <w:tcW w:w="1378" w:type="dxa"/>
+            <w:vAlign w:val="center"/>
+            <w:hideMark/>
+          </w:tcPr>
+          <w:p>
+            <w:proofErr w:type="spellStart"/>
+            <w:r>
+              <w:t>email,token</w:t>
+            </w:r>
+            <w:proofErr w:type="spellEnd"/>
+          </w:p>
+        </w:tc>
+        <w:tc>
+          <w:tcPr>
+            <w:tcW w:w="1792" w:type="dxa"/>
+            <w:vAlign w:val="center"/>
+            <w:hideMark/>
+          </w:tcPr>
+          <w:p>
+            <w:r>
+              <w:t xml:space="preserve">Az összes rendelést kiadja. </w:t>
+            </w:r>
+          </w:p>
+        </w:tc>
+      </w:tr>
+      <w:tr>
+        <w:trPr>
+          <w:trHeight w:val="911"/>
+          <w:tblCellSpacing w:w="15" w:type="dxa"/>
+        </w:trPr>
+        <w:tc>
+          <w:tcPr>
+            <w:tcW w:w="3069" w:type="dxa"/>
+            <w:vAlign w:val="center"/>
+          </w:tcPr>
+          <w:p>
+            <w:pPr>
+              <w:rPr>
+                <w:rStyle w:val="HTML-kd"/>
+                <w:rFonts w:eastAsiaTheme="minorHAnsi"/>
+              </w:rPr>
+            </w:pPr>
+            <w:r>
+              <w:rPr>
+                <w:rStyle w:val="HTML-kd"/>
+                <w:rFonts w:eastAsiaTheme="minorHAnsi"/>
+              </w:rPr>
+              <w:t>/</w:t>
+            </w:r>
+            <w:proofErr w:type="spellStart"/>
+            <w:r>
+              <w:rPr>
+                <w:rStyle w:val="HTML-kd"/>
+                <w:rFonts w:eastAsiaTheme="minorHAnsi"/>
+              </w:rPr>
+              <w:t>konyvek</w:t>
+            </w:r>
+            <w:proofErr w:type="spellEnd"/>
+            <w:r>
+              <w:rPr>
+                <w:rStyle w:val="HTML-kd"/>
+                <w:rFonts w:eastAsiaTheme="minorHAnsi"/>
+              </w:rPr>
+              <w:t>/</w:t>
+            </w:r>
+            <w:proofErr w:type="spellStart"/>
+            <w:r>
+              <w:rPr>
+                <w:rStyle w:val="HTML-kd"/>
+                <w:rFonts w:eastAsiaTheme="minorHAnsi"/>
+              </w:rPr>
+              <w:t>rendeles_statusz_modositas</w:t>
+            </w:r>
+            <w:proofErr w:type="spellEnd"/>
+          </w:p>
+        </w:tc>
+        <w:tc>
+          <w:tcPr>
+            <w:tcW w:w="820" w:type="dxa"/>
+            <w:vAlign w:val="center"/>
+          </w:tcPr>
+          <w:p>
+            <w:r>
+              <w:t>PUT</w:t>
+            </w:r>
+          </w:p>
+        </w:tc>
+        <w:tc>
+          <w:tcPr>
+            <w:tcW w:w="1823" w:type="dxa"/>
+            <w:vAlign w:val="center"/>
+          </w:tcPr>
+          <w:p>
+            <w:r>
+              <w:t>A rendelések státuszát lehet vele változtatni</w:t>
+            </w:r>
+          </w:p>
+        </w:tc>
+        <w:tc>
+          <w:tcPr>
+            <w:tcW w:w="1378" w:type="dxa"/>
+            <w:vAlign w:val="center"/>
+          </w:tcPr>
+          <w:p>
+            <w:r>
+              <w:t xml:space="preserve">email </w:t>
+            </w:r>
+            <w:proofErr w:type="spellStart"/>
+            <w:r>
+              <w:t>token</w:t>
+            </w:r>
+            <w:proofErr w:type="spellEnd"/>
+            <w:r>
+              <w:t xml:space="preserve"> </w:t>
+            </w:r>
+            <w:proofErr w:type="spellStart"/>
+            <w:r>
+              <w:t>statusz,szamlaszam</w:t>
+            </w:r>
+            <w:proofErr w:type="spellEnd"/>
+          </w:p>
+        </w:tc>
+        <w:tc>
+          <w:tcPr>
+            <w:tcW w:w="1792" w:type="dxa"/>
+            <w:vAlign w:val="center"/>
+          </w:tcPr>
+          <w:p>
+            <w:r>
+              <w:t>A kiválasztott rendelést megváltoztatja.</w:t>
+            </w:r>
+          </w:p>
         </w:tc>
       </w:tr>
       <w:tr>
@@ -6129,72 +6603,292 @@
         </w:trPr>
         <w:tc>
           <w:tcPr>
-            <w:tcW w:w="0" w:type="auto"/>
-            <w:vAlign w:val="center"/>
-          </w:tcPr>
-          <w:p>
-            <w:pPr>
-              <w:rPr>
-                <w:rStyle w:val="HTML-kd"/>
-                <w:rFonts w:eastAsiaTheme="minorHAnsi"/>
-              </w:rPr>
-            </w:pPr>
-            <w:r>
+            <w:tcW w:w="3069" w:type="dxa"/>
+            <w:vAlign w:val="center"/>
+          </w:tcPr>
+          <w:p>
+            <w:pPr>
+              <w:rPr>
+                <w:rStyle w:val="HTML-kd"/>
+                <w:rFonts w:eastAsiaTheme="minorHAnsi"/>
+              </w:rPr>
+            </w:pPr>
+            <w:r>
+              <w:rPr>
+                <w:rStyle w:val="HTML-kd"/>
+                <w:rFonts w:eastAsiaTheme="minorHAnsi"/>
+              </w:rPr>
               <w:t>/</w:t>
             </w:r>
             <w:proofErr w:type="spellStart"/>
             <w:r>
+              <w:rPr>
+                <w:rStyle w:val="HTML-kd"/>
+                <w:rFonts w:eastAsiaTheme="minorHAnsi"/>
+              </w:rPr>
               <w:t>konyvek</w:t>
             </w:r>
             <w:proofErr w:type="spellEnd"/>
             <w:r>
+              <w:rPr>
+                <w:rStyle w:val="HTML-kd"/>
+                <w:rFonts w:eastAsiaTheme="minorHAnsi"/>
+              </w:rPr>
               <w:t>/</w:t>
             </w:r>
             <w:proofErr w:type="spellStart"/>
             <w:r>
-              <w:t>search?kiado</w:t>
-            </w:r>
-            <w:proofErr w:type="spellEnd"/>
-            <w:r>
-              <w:t>=’’</w:t>
-            </w:r>
-          </w:p>
-        </w:tc>
-        <w:tc>
-          <w:tcPr>
-            <w:tcW w:w="0" w:type="auto"/>
-            <w:vAlign w:val="center"/>
-          </w:tcPr>
-          <w:p>
-            <w:r>
-              <w:t>GET</w:t>
-            </w:r>
-          </w:p>
-        </w:tc>
-        <w:tc>
-          <w:tcPr>
-            <w:tcW w:w="0" w:type="auto"/>
-            <w:vAlign w:val="center"/>
-          </w:tcPr>
-          <w:p>
-            <w:r>
-              <w:t xml:space="preserve">A kiadó alapján szűr. </w:t>
-            </w:r>
-          </w:p>
-        </w:tc>
-        <w:tc>
-          <w:tcPr>
-            <w:tcW w:w="0" w:type="auto"/>
-            <w:vAlign w:val="center"/>
-          </w:tcPr>
-          <w:p/>
-        </w:tc>
-        <w:tc>
-          <w:tcPr>
-            <w:tcW w:w="0" w:type="auto"/>
-            <w:vAlign w:val="center"/>
-          </w:tcPr>
-          <w:p/>
+              <w:rPr>
+                <w:rStyle w:val="HTML-kd"/>
+                <w:rFonts w:eastAsiaTheme="minorHAnsi"/>
+              </w:rPr>
+              <w:t>raktar_modosit</w:t>
+            </w:r>
+            <w:proofErr w:type="spellEnd"/>
+          </w:p>
+        </w:tc>
+        <w:tc>
+          <w:tcPr>
+            <w:tcW w:w="820" w:type="dxa"/>
+            <w:vAlign w:val="center"/>
+          </w:tcPr>
+          <w:p>
+            <w:r>
+              <w:t>PU</w:t>
+            </w:r>
+            <w:r>
+              <w:t>T</w:t>
+            </w:r>
+          </w:p>
+        </w:tc>
+        <w:tc>
+          <w:tcPr>
+            <w:tcW w:w="1823" w:type="dxa"/>
+            <w:vAlign w:val="center"/>
+          </w:tcPr>
+          <w:p>
+            <w:r>
+              <w:t>A raktárban található mennyiséget változtathatjuk.</w:t>
+            </w:r>
+          </w:p>
+        </w:tc>
+        <w:tc>
+          <w:tcPr>
+            <w:tcW w:w="1378" w:type="dxa"/>
+            <w:vAlign w:val="center"/>
+          </w:tcPr>
+          <w:p>
+            <w:r>
+              <w:t xml:space="preserve">email </w:t>
+            </w:r>
+            <w:proofErr w:type="spellStart"/>
+            <w:r>
+              <w:t>token</w:t>
+            </w:r>
+            <w:proofErr w:type="spellEnd"/>
+            <w:r>
+              <w:t xml:space="preserve"> ISBN </w:t>
+            </w:r>
+            <w:proofErr w:type="spellStart"/>
+            <w:r>
+              <w:t>raktar</w:t>
+            </w:r>
+            <w:proofErr w:type="spellEnd"/>
+          </w:p>
+        </w:tc>
+        <w:tc>
+          <w:tcPr>
+            <w:tcW w:w="1792" w:type="dxa"/>
+            <w:vAlign w:val="center"/>
+          </w:tcPr>
+          <w:p>
+            <w:r>
+              <w:t>Az adott termék raktáron lévő mezője megváltozik.</w:t>
+            </w:r>
+          </w:p>
+        </w:tc>
+      </w:tr>
+    </w:tbl>
+    <w:p>
+      <w:pPr>
+        <w:rPr>
+          <w:noProof/>
+        </w:rPr>
+      </w:pPr>
+      <w:r>
+        <w:rPr>
+          <w:noProof/>
+        </w:rPr>
+        <w:br/>
+      </w:r>
+      <w:r>
+        <w:rPr>
+          <w:noProof/>
+        </w:rPr>
+        <w:t>Az oldal admin felülethez tartozó backend végpontjai (</w:t>
+      </w:r>
+      <w:r>
+        <w:rPr>
+          <w:noProof/>
+        </w:rPr>
+        <w:t>Felhasználó</w:t>
+      </w:r>
+      <w:r>
+        <w:rPr>
+          <w:noProof/>
+        </w:rPr>
+        <w:t>).</w:t>
+      </w:r>
+    </w:p>
+    <w:tbl>
+      <w:tblPr>
+        <w:tblW w:w="0" w:type="auto"/>
+        <w:tblCellSpacing w:w="15" w:type="dxa"/>
+        <w:tblBorders>
+          <w:top w:val="single" w:sz="4" w:space="0" w:color="auto"/>
+          <w:left w:val="single" w:sz="4" w:space="0" w:color="auto"/>
+          <w:bottom w:val="single" w:sz="4" w:space="0" w:color="auto"/>
+          <w:right w:val="single" w:sz="4" w:space="0" w:color="auto"/>
+          <w:insideH w:val="single" w:sz="4" w:space="0" w:color="auto"/>
+          <w:insideV w:val="single" w:sz="4" w:space="0" w:color="auto"/>
+        </w:tblBorders>
+        <w:tblLayout w:type="fixed"/>
+        <w:tblCellMar>
+          <w:top w:w="15" w:type="dxa"/>
+          <w:left w:w="15" w:type="dxa"/>
+          <w:bottom w:w="15" w:type="dxa"/>
+          <w:right w:w="15" w:type="dxa"/>
+        </w:tblCellMar>
+        <w:tblLook w:val="04A0" w:firstRow="1" w:lastRow="0" w:firstColumn="1" w:lastColumn="0" w:noHBand="0" w:noVBand="1"/>
+      </w:tblPr>
+      <w:tblGrid>
+        <w:gridCol w:w="3256"/>
+        <w:gridCol w:w="708"/>
+        <w:gridCol w:w="1853"/>
+        <w:gridCol w:w="1408"/>
+        <w:gridCol w:w="1837"/>
+      </w:tblGrid>
+      <w:tr>
+        <w:trPr>
+          <w:tblHeader/>
+          <w:tblCellSpacing w:w="15" w:type="dxa"/>
+        </w:trPr>
+        <w:tc>
+          <w:tcPr>
+            <w:tcW w:w="3211" w:type="dxa"/>
+            <w:vAlign w:val="center"/>
+            <w:hideMark/>
+          </w:tcPr>
+          <w:p>
+            <w:pPr>
+              <w:jc w:val="center"/>
+              <w:rPr>
+                <w:b/>
+                <w:bCs/>
+              </w:rPr>
+            </w:pPr>
+            <w:r>
+              <w:rPr>
+                <w:b/>
+                <w:bCs/>
+              </w:rPr>
+              <w:t>Végpont</w:t>
+            </w:r>
+          </w:p>
+        </w:tc>
+        <w:tc>
+          <w:tcPr>
+            <w:tcW w:w="678" w:type="dxa"/>
+            <w:vAlign w:val="center"/>
+            <w:hideMark/>
+          </w:tcPr>
+          <w:p>
+            <w:pPr>
+              <w:jc w:val="center"/>
+              <w:rPr>
+                <w:b/>
+                <w:bCs/>
+              </w:rPr>
+            </w:pPr>
+            <w:proofErr w:type="spellStart"/>
+            <w:r>
+              <w:rPr>
+                <w:b/>
+                <w:bCs/>
+              </w:rPr>
+              <w:t>Method</w:t>
+            </w:r>
+            <w:proofErr w:type="spellEnd"/>
+          </w:p>
+        </w:tc>
+        <w:tc>
+          <w:tcPr>
+            <w:tcW w:w="1823" w:type="dxa"/>
+            <w:vAlign w:val="center"/>
+            <w:hideMark/>
+          </w:tcPr>
+          <w:p>
+            <w:pPr>
+              <w:jc w:val="center"/>
+              <w:rPr>
+                <w:b/>
+                <w:bCs/>
+              </w:rPr>
+            </w:pPr>
+            <w:r>
+              <w:rPr>
+                <w:b/>
+                <w:bCs/>
+              </w:rPr>
+              <w:t>Leírás</w:t>
+            </w:r>
+          </w:p>
+        </w:tc>
+        <w:tc>
+          <w:tcPr>
+            <w:tcW w:w="1378" w:type="dxa"/>
+            <w:vAlign w:val="center"/>
+            <w:hideMark/>
+          </w:tcPr>
+          <w:p>
+            <w:pPr>
+              <w:jc w:val="center"/>
+              <w:rPr>
+                <w:b/>
+                <w:bCs/>
+              </w:rPr>
+            </w:pPr>
+            <w:r>
+              <w:rPr>
+                <w:b/>
+                <w:bCs/>
+              </w:rPr>
+              <w:t>Bemenet</w:t>
+            </w:r>
+          </w:p>
+        </w:tc>
+        <w:tc>
+          <w:tcPr>
+            <w:tcW w:w="1792" w:type="dxa"/>
+            <w:vAlign w:val="center"/>
+            <w:hideMark/>
+          </w:tcPr>
+          <w:p>
+            <w:pPr>
+              <w:jc w:val="center"/>
+              <w:rPr>
+                <w:b/>
+                <w:bCs/>
+              </w:rPr>
+            </w:pPr>
+            <w:r>
+              <w:rPr>
+                <w:b/>
+                <w:bCs/>
+              </w:rPr>
+              <w:t>Kimenet</w:t>
+            </w:r>
+          </w:p>
         </w:tc>
       </w:tr>
       <w:tr>
@@ -6203,35 +6897,50 @@
         </w:trPr>
         <w:tc>
           <w:tcPr>
-            <w:tcW w:w="0" w:type="auto"/>
-            <w:vAlign w:val="center"/>
-          </w:tcPr>
-          <w:p>
-            <w:r>
+            <w:tcW w:w="3211" w:type="dxa"/>
+            <w:vAlign w:val="center"/>
+            <w:hideMark/>
+          </w:tcPr>
+          <w:p>
+            <w:r>
+              <w:rPr>
+                <w:rStyle w:val="HTML-kd"/>
+                <w:rFonts w:eastAsiaTheme="minorHAnsi"/>
+              </w:rPr>
               <w:t>/</w:t>
             </w:r>
             <w:proofErr w:type="spellStart"/>
             <w:r>
+              <w:rPr>
+                <w:rStyle w:val="HTML-kd"/>
+                <w:rFonts w:eastAsiaTheme="minorHAnsi"/>
+              </w:rPr>
               <w:t>konyvek</w:t>
             </w:r>
             <w:proofErr w:type="spellEnd"/>
             <w:r>
+              <w:rPr>
+                <w:rStyle w:val="HTML-kd"/>
+                <w:rFonts w:eastAsiaTheme="minorHAnsi"/>
+              </w:rPr>
               <w:t>/</w:t>
             </w:r>
             <w:proofErr w:type="spellStart"/>
             <w:r>
-              <w:t>search?cim</w:t>
-            </w:r>
-            <w:proofErr w:type="spellEnd"/>
-            <w:r>
-              <w:t>=’’</w:t>
-            </w:r>
-          </w:p>
-        </w:tc>
-        <w:tc>
-          <w:tcPr>
-            <w:tcW w:w="0" w:type="auto"/>
-            <w:vAlign w:val="center"/>
+              <w:rPr>
+                <w:rStyle w:val="HTML-kd"/>
+                <w:rFonts w:eastAsiaTheme="minorHAnsi"/>
+              </w:rPr>
+              <w:t>adminuser</w:t>
+            </w:r>
+            <w:proofErr w:type="spellEnd"/>
+          </w:p>
+        </w:tc>
+        <w:tc>
+          <w:tcPr>
+            <w:tcW w:w="678" w:type="dxa"/>
+            <w:vAlign w:val="center"/>
+            <w:hideMark/>
           </w:tcPr>
           <w:p>
             <w:r>
@@ -6241,34 +6950,829 @@
         </w:tc>
         <w:tc>
           <w:tcPr>
-            <w:tcW w:w="0" w:type="auto"/>
-            <w:vAlign w:val="center"/>
-          </w:tcPr>
-          <w:p>
-            <w:r>
-              <w:t xml:space="preserve"> A cím alapján szűr. </w:t>
-            </w:r>
-          </w:p>
-        </w:tc>
-        <w:tc>
-          <w:tcPr>
-            <w:tcW w:w="0" w:type="auto"/>
-            <w:vAlign w:val="center"/>
-          </w:tcPr>
-          <w:p/>
-        </w:tc>
-        <w:tc>
-          <w:tcPr>
-            <w:tcW w:w="0" w:type="auto"/>
-            <w:vAlign w:val="center"/>
-          </w:tcPr>
-          <w:p/>
+            <w:tcW w:w="1823" w:type="dxa"/>
+            <w:vAlign w:val="center"/>
+            <w:hideMark/>
+          </w:tcPr>
+          <w:p>
+            <w:r>
+              <w:t>Az összes felhasználót kiadja.</w:t>
+            </w:r>
+          </w:p>
+        </w:tc>
+        <w:tc>
+          <w:tcPr>
+            <w:tcW w:w="1378" w:type="dxa"/>
+            <w:vAlign w:val="center"/>
+            <w:hideMark/>
+          </w:tcPr>
+          <w:p>
+            <w:proofErr w:type="spellStart"/>
+            <w:r>
+              <w:t>email,token</w:t>
+            </w:r>
+            <w:proofErr w:type="spellEnd"/>
+          </w:p>
+        </w:tc>
+        <w:tc>
+          <w:tcPr>
+            <w:tcW w:w="1792" w:type="dxa"/>
+            <w:vAlign w:val="center"/>
+            <w:hideMark/>
+          </w:tcPr>
+          <w:p>
+            <w:r>
+              <w:t>Az összes felhasználó adatai.</w:t>
+            </w:r>
+          </w:p>
+        </w:tc>
+      </w:tr>
+      <w:tr>
+        <w:trPr>
+          <w:trHeight w:val="911"/>
+          <w:tblCellSpacing w:w="15" w:type="dxa"/>
+        </w:trPr>
+        <w:tc>
+          <w:tcPr>
+            <w:tcW w:w="3211" w:type="dxa"/>
+            <w:vAlign w:val="center"/>
+          </w:tcPr>
+          <w:p>
+            <w:pPr>
+              <w:rPr>
+                <w:rStyle w:val="HTML-kd"/>
+                <w:rFonts w:eastAsiaTheme="minorHAnsi"/>
+              </w:rPr>
+            </w:pPr>
+            <w:r>
+              <w:rPr>
+                <w:rStyle w:val="HTML-kd"/>
+                <w:rFonts w:eastAsiaTheme="minorHAnsi"/>
+              </w:rPr>
+              <w:t>/</w:t>
+            </w:r>
+            <w:proofErr w:type="spellStart"/>
+            <w:r>
+              <w:rPr>
+                <w:rStyle w:val="HTML-kd"/>
+                <w:rFonts w:eastAsiaTheme="minorHAnsi"/>
+              </w:rPr>
+              <w:t>konyvek</w:t>
+            </w:r>
+            <w:proofErr w:type="spellEnd"/>
+            <w:r>
+              <w:rPr>
+                <w:rStyle w:val="HTML-kd"/>
+                <w:rFonts w:eastAsiaTheme="minorHAnsi"/>
+              </w:rPr>
+              <w:t>/</w:t>
+            </w:r>
+            <w:proofErr w:type="spellStart"/>
+            <w:r>
+              <w:rPr>
+                <w:rStyle w:val="HTML-kd"/>
+                <w:rFonts w:eastAsiaTheme="minorHAnsi"/>
+              </w:rPr>
+              <w:t>adminuserdelete</w:t>
+            </w:r>
+            <w:proofErr w:type="spellEnd"/>
+          </w:p>
+        </w:tc>
+        <w:tc>
+          <w:tcPr>
+            <w:tcW w:w="678" w:type="dxa"/>
+            <w:vAlign w:val="center"/>
+          </w:tcPr>
+          <w:p>
+            <w:r>
+              <w:t>PUT</w:t>
+            </w:r>
+          </w:p>
+        </w:tc>
+        <w:tc>
+          <w:tcPr>
+            <w:tcW w:w="1823" w:type="dxa"/>
+            <w:vAlign w:val="center"/>
+          </w:tcPr>
+          <w:p>
+            <w:r>
+              <w:t xml:space="preserve">A </w:t>
+            </w:r>
+            <w:r>
+              <w:t xml:space="preserve">kiválasztott felhasználót törli. </w:t>
+            </w:r>
+          </w:p>
+        </w:tc>
+        <w:tc>
+          <w:tcPr>
+            <w:tcW w:w="1378" w:type="dxa"/>
+            <w:vAlign w:val="center"/>
+          </w:tcPr>
+          <w:p>
+            <w:r>
+              <w:t xml:space="preserve">email </w:t>
+            </w:r>
+            <w:proofErr w:type="spellStart"/>
+            <w:r>
+              <w:t>token</w:t>
+            </w:r>
+            <w:proofErr w:type="spellEnd"/>
+            <w:r>
+              <w:t>,</w:t>
+            </w:r>
+            <w:r>
+              <w:t xml:space="preserve"> </w:t>
+            </w:r>
+            <w:proofErr w:type="spellStart"/>
+            <w:r>
+              <w:t>felhasznalo_email</w:t>
+            </w:r>
+            <w:proofErr w:type="spellEnd"/>
+          </w:p>
+        </w:tc>
+        <w:tc>
+          <w:tcPr>
+            <w:tcW w:w="1792" w:type="dxa"/>
+            <w:vAlign w:val="center"/>
+          </w:tcPr>
+          <w:p>
+            <w:r>
+              <w:t xml:space="preserve">A kiválasztott </w:t>
+            </w:r>
+            <w:r>
+              <w:t>felhasználó nevét, lakcímét, adószámát, jelszavát és jogosultságát TÖRÖLT-re állítja.</w:t>
+            </w:r>
+          </w:p>
+        </w:tc>
+      </w:tr>
+      <w:tr>
+        <w:trPr>
+          <w:tblCellSpacing w:w="15" w:type="dxa"/>
+        </w:trPr>
+        <w:tc>
+          <w:tcPr>
+            <w:tcW w:w="3211" w:type="dxa"/>
+            <w:vAlign w:val="center"/>
+          </w:tcPr>
+          <w:p>
+            <w:pPr>
+              <w:rPr>
+                <w:rStyle w:val="HTML-kd"/>
+                <w:rFonts w:eastAsiaTheme="minorHAnsi"/>
+              </w:rPr>
+            </w:pPr>
+            <w:r>
+              <w:rPr>
+                <w:rStyle w:val="HTML-kd"/>
+                <w:rFonts w:eastAsiaTheme="minorHAnsi"/>
+              </w:rPr>
+              <w:t>/</w:t>
+            </w:r>
+            <w:proofErr w:type="spellStart"/>
+            <w:r>
+              <w:rPr>
+                <w:rStyle w:val="HTML-kd"/>
+                <w:rFonts w:eastAsiaTheme="minorHAnsi"/>
+              </w:rPr>
+              <w:t>konyvek</w:t>
+            </w:r>
+            <w:proofErr w:type="spellEnd"/>
+            <w:r>
+              <w:rPr>
+                <w:rStyle w:val="HTML-kd"/>
+                <w:rFonts w:eastAsiaTheme="minorHAnsi"/>
+              </w:rPr>
+              <w:t>/</w:t>
+            </w:r>
+            <w:proofErr w:type="spellStart"/>
+            <w:r>
+              <w:rPr>
+                <w:rStyle w:val="HTML-kd"/>
+                <w:rFonts w:eastAsiaTheme="minorHAnsi"/>
+              </w:rPr>
+              <w:t>updatejogosultsag</w:t>
+            </w:r>
+            <w:proofErr w:type="spellEnd"/>
+          </w:p>
+        </w:tc>
+        <w:tc>
+          <w:tcPr>
+            <w:tcW w:w="678" w:type="dxa"/>
+            <w:vAlign w:val="center"/>
+          </w:tcPr>
+          <w:p>
+            <w:r>
+              <w:t>PUT</w:t>
+            </w:r>
+          </w:p>
+        </w:tc>
+        <w:tc>
+          <w:tcPr>
+            <w:tcW w:w="1823" w:type="dxa"/>
+            <w:vAlign w:val="center"/>
+          </w:tcPr>
+          <w:p>
+            <w:r>
+              <w:t xml:space="preserve">A </w:t>
+            </w:r>
+            <w:r>
+              <w:t>kiválasztott felhasználó jogosultságát megváltoztatja.</w:t>
+            </w:r>
+          </w:p>
+        </w:tc>
+        <w:tc>
+          <w:tcPr>
+            <w:tcW w:w="1378" w:type="dxa"/>
+            <w:vAlign w:val="center"/>
+          </w:tcPr>
+          <w:p>
+            <w:r>
+              <w:t>email</w:t>
+            </w:r>
+            <w:r>
+              <w:t>,</w:t>
+            </w:r>
+            <w:r>
+              <w:t xml:space="preserve"> </w:t>
+            </w:r>
+            <w:proofErr w:type="spellStart"/>
+            <w:r>
+              <w:t>token</w:t>
+            </w:r>
+            <w:proofErr w:type="spellEnd"/>
+            <w:r>
+              <w:t xml:space="preserve">, </w:t>
+            </w:r>
+            <w:proofErr w:type="spellStart"/>
+            <w:r>
+              <w:t>felhasznalo_email</w:t>
+            </w:r>
+            <w:proofErr w:type="spellEnd"/>
+            <w:r>
+              <w:t xml:space="preserve">, </w:t>
+            </w:r>
+            <w:proofErr w:type="spellStart"/>
+            <w:r>
+              <w:t>jogosultsag</w:t>
+            </w:r>
+            <w:proofErr w:type="spellEnd"/>
+            <w:r>
+              <w:t xml:space="preserve"> </w:t>
+            </w:r>
+          </w:p>
+        </w:tc>
+        <w:tc>
+          <w:tcPr>
+            <w:tcW w:w="1792" w:type="dxa"/>
+            <w:vAlign w:val="center"/>
+          </w:tcPr>
+          <w:p>
+            <w:r>
+              <w:t xml:space="preserve">A kiválasztott felhasználó jogosultsága megváltozik. </w:t>
+            </w:r>
+          </w:p>
         </w:tc>
       </w:tr>
     </w:tbl>
-    <w:p/>
-    <w:p/>
-    <w:p/>
+    <w:p>
+      <w:pPr>
+        <w:rPr>
+          <w:noProof/>
+        </w:rPr>
+      </w:pPr>
+    </w:p>
+    <w:p>
+      <w:pPr>
+        <w:rPr>
+          <w:noProof/>
+        </w:rPr>
+      </w:pPr>
+      <w:r>
+        <w:rPr>
+          <w:noProof/>
+        </w:rPr>
+        <w:t>Az oldal admin felülethez tartozó backend végpontjai (Felhasználó).</w:t>
+      </w:r>
+      <w:r>
+        <w:rPr>
+          <w:noProof/>
+        </w:rPr>
+        <w:br/>
+      </w:r>
+    </w:p>
+    <w:p>
+      <w:pPr>
+        <w:rPr>
+          <w:noProof/>
+        </w:rPr>
+      </w:pPr>
+    </w:p>
+    <w:tbl>
+      <w:tblPr>
+        <w:tblW w:w="0" w:type="auto"/>
+        <w:tblCellSpacing w:w="15" w:type="dxa"/>
+        <w:tblBorders>
+          <w:top w:val="single" w:sz="4" w:space="0" w:color="auto"/>
+          <w:left w:val="single" w:sz="4" w:space="0" w:color="auto"/>
+          <w:bottom w:val="single" w:sz="4" w:space="0" w:color="auto"/>
+          <w:right w:val="single" w:sz="4" w:space="0" w:color="auto"/>
+          <w:insideH w:val="single" w:sz="4" w:space="0" w:color="auto"/>
+          <w:insideV w:val="single" w:sz="4" w:space="0" w:color="auto"/>
+        </w:tblBorders>
+        <w:tblLayout w:type="fixed"/>
+        <w:tblCellMar>
+          <w:top w:w="15" w:type="dxa"/>
+          <w:left w:w="15" w:type="dxa"/>
+          <w:bottom w:w="15" w:type="dxa"/>
+          <w:right w:w="15" w:type="dxa"/>
+        </w:tblCellMar>
+        <w:tblLook w:val="04A0" w:firstRow="1" w:lastRow="0" w:firstColumn="1" w:lastColumn="0" w:noHBand="0" w:noVBand="1"/>
+      </w:tblPr>
+      <w:tblGrid>
+        <w:gridCol w:w="3256"/>
+        <w:gridCol w:w="708"/>
+        <w:gridCol w:w="1853"/>
+        <w:gridCol w:w="1408"/>
+        <w:gridCol w:w="1837"/>
+      </w:tblGrid>
+      <w:tr>
+        <w:trPr>
+          <w:tblHeader/>
+          <w:tblCellSpacing w:w="15" w:type="dxa"/>
+        </w:trPr>
+        <w:tc>
+          <w:tcPr>
+            <w:tcW w:w="3211" w:type="dxa"/>
+            <w:vAlign w:val="center"/>
+            <w:hideMark/>
+          </w:tcPr>
+          <w:p>
+            <w:pPr>
+              <w:jc w:val="center"/>
+              <w:rPr>
+                <w:b/>
+                <w:bCs/>
+              </w:rPr>
+            </w:pPr>
+            <w:r>
+              <w:rPr>
+                <w:b/>
+                <w:bCs/>
+              </w:rPr>
+              <w:lastRenderedPageBreak/>
+              <w:t>Végpont</w:t>
+            </w:r>
+          </w:p>
+        </w:tc>
+        <w:tc>
+          <w:tcPr>
+            <w:tcW w:w="678" w:type="dxa"/>
+            <w:vAlign w:val="center"/>
+            <w:hideMark/>
+          </w:tcPr>
+          <w:p>
+            <w:pPr>
+              <w:jc w:val="center"/>
+              <w:rPr>
+                <w:b/>
+                <w:bCs/>
+              </w:rPr>
+            </w:pPr>
+            <w:proofErr w:type="spellStart"/>
+            <w:r>
+              <w:rPr>
+                <w:b/>
+                <w:bCs/>
+              </w:rPr>
+              <w:t>Method</w:t>
+            </w:r>
+            <w:proofErr w:type="spellEnd"/>
+          </w:p>
+        </w:tc>
+        <w:tc>
+          <w:tcPr>
+            <w:tcW w:w="1823" w:type="dxa"/>
+            <w:vAlign w:val="center"/>
+            <w:hideMark/>
+          </w:tcPr>
+          <w:p>
+            <w:pPr>
+              <w:jc w:val="center"/>
+              <w:rPr>
+                <w:b/>
+                <w:bCs/>
+              </w:rPr>
+            </w:pPr>
+            <w:r>
+              <w:rPr>
+                <w:b/>
+                <w:bCs/>
+              </w:rPr>
+              <w:t>Leírás</w:t>
+            </w:r>
+          </w:p>
+        </w:tc>
+        <w:tc>
+          <w:tcPr>
+            <w:tcW w:w="1378" w:type="dxa"/>
+            <w:vAlign w:val="center"/>
+            <w:hideMark/>
+          </w:tcPr>
+          <w:p>
+            <w:pPr>
+              <w:jc w:val="center"/>
+              <w:rPr>
+                <w:b/>
+                <w:bCs/>
+              </w:rPr>
+            </w:pPr>
+            <w:r>
+              <w:rPr>
+                <w:b/>
+                <w:bCs/>
+              </w:rPr>
+              <w:t>Bemenet</w:t>
+            </w:r>
+          </w:p>
+        </w:tc>
+        <w:tc>
+          <w:tcPr>
+            <w:tcW w:w="1792" w:type="dxa"/>
+            <w:vAlign w:val="center"/>
+            <w:hideMark/>
+          </w:tcPr>
+          <w:p>
+            <w:pPr>
+              <w:jc w:val="center"/>
+              <w:rPr>
+                <w:b/>
+                <w:bCs/>
+              </w:rPr>
+            </w:pPr>
+            <w:r>
+              <w:rPr>
+                <w:b/>
+                <w:bCs/>
+              </w:rPr>
+              <w:t>Kimenet</w:t>
+            </w:r>
+          </w:p>
+        </w:tc>
+      </w:tr>
+      <w:tr>
+        <w:trPr>
+          <w:tblCellSpacing w:w="15" w:type="dxa"/>
+        </w:trPr>
+        <w:tc>
+          <w:tcPr>
+            <w:tcW w:w="3211" w:type="dxa"/>
+            <w:vAlign w:val="center"/>
+            <w:hideMark/>
+          </w:tcPr>
+          <w:p>
+            <w:r>
+              <w:rPr>
+                <w:rStyle w:val="HTML-kd"/>
+                <w:rFonts w:eastAsiaTheme="minorHAnsi"/>
+              </w:rPr>
+              <w:t>/</w:t>
+            </w:r>
+            <w:proofErr w:type="spellStart"/>
+            <w:r>
+              <w:rPr>
+                <w:rStyle w:val="HTML-kd"/>
+                <w:rFonts w:eastAsiaTheme="minorHAnsi"/>
+              </w:rPr>
+              <w:t>konyvek</w:t>
+            </w:r>
+            <w:proofErr w:type="spellEnd"/>
+            <w:r>
+              <w:rPr>
+                <w:rStyle w:val="HTML-kd"/>
+                <w:rFonts w:eastAsiaTheme="minorHAnsi"/>
+              </w:rPr>
+              <w:t>/</w:t>
+            </w:r>
+            <w:proofErr w:type="spellStart"/>
+            <w:r>
+              <w:rPr>
+                <w:rStyle w:val="HTML-kd"/>
+                <w:rFonts w:eastAsiaTheme="minorHAnsi"/>
+              </w:rPr>
+              <w:t>adminosszeskonyv</w:t>
+            </w:r>
+            <w:proofErr w:type="spellEnd"/>
+          </w:p>
+        </w:tc>
+        <w:tc>
+          <w:tcPr>
+            <w:tcW w:w="678" w:type="dxa"/>
+            <w:vAlign w:val="center"/>
+            <w:hideMark/>
+          </w:tcPr>
+          <w:p>
+            <w:r>
+              <w:t>GET</w:t>
+            </w:r>
+          </w:p>
+        </w:tc>
+        <w:tc>
+          <w:tcPr>
+            <w:tcW w:w="1823" w:type="dxa"/>
+            <w:vAlign w:val="center"/>
+            <w:hideMark/>
+          </w:tcPr>
+          <w:p>
+            <w:r>
+              <w:t>Az összes könyv összes információját kiadja.</w:t>
+            </w:r>
+          </w:p>
+        </w:tc>
+        <w:tc>
+          <w:tcPr>
+            <w:tcW w:w="1378" w:type="dxa"/>
+            <w:vAlign w:val="center"/>
+            <w:hideMark/>
+          </w:tcPr>
+          <w:p>
+            <w:proofErr w:type="spellStart"/>
+            <w:r>
+              <w:t>email,</w:t>
+            </w:r>
+            <w:r>
+              <w:t>token</w:t>
+            </w:r>
+            <w:proofErr w:type="spellEnd"/>
+            <w:r>
+              <w:t>,</w:t>
+            </w:r>
+          </w:p>
+        </w:tc>
+        <w:tc>
+          <w:tcPr>
+            <w:tcW w:w="1792" w:type="dxa"/>
+            <w:vAlign w:val="center"/>
+            <w:hideMark/>
+          </w:tcPr>
+          <w:p>
+            <w:r>
+              <w:t xml:space="preserve">Az összes </w:t>
+            </w:r>
+            <w:r>
+              <w:t>könyv adatai</w:t>
+            </w:r>
+          </w:p>
+        </w:tc>
+      </w:tr>
+      <w:tr>
+        <w:trPr>
+          <w:trHeight w:val="911"/>
+          <w:tblCellSpacing w:w="15" w:type="dxa"/>
+        </w:trPr>
+        <w:tc>
+          <w:tcPr>
+            <w:tcW w:w="3211" w:type="dxa"/>
+            <w:vAlign w:val="center"/>
+          </w:tcPr>
+          <w:p>
+            <w:pPr>
+              <w:rPr>
+                <w:rStyle w:val="HTML-kd"/>
+                <w:rFonts w:eastAsiaTheme="minorHAnsi"/>
+              </w:rPr>
+            </w:pPr>
+            <w:r>
+              <w:rPr>
+                <w:rStyle w:val="HTML-kd"/>
+                <w:rFonts w:eastAsiaTheme="minorHAnsi"/>
+              </w:rPr>
+              <w:t>/</w:t>
+            </w:r>
+            <w:proofErr w:type="spellStart"/>
+            <w:r>
+              <w:rPr>
+                <w:rStyle w:val="HTML-kd"/>
+                <w:rFonts w:eastAsiaTheme="minorHAnsi"/>
+              </w:rPr>
+              <w:t>konyvek</w:t>
+            </w:r>
+            <w:proofErr w:type="spellEnd"/>
+            <w:r>
+              <w:rPr>
+                <w:rStyle w:val="HTML-kd"/>
+                <w:rFonts w:eastAsiaTheme="minorHAnsi"/>
+              </w:rPr>
+              <w:t>/</w:t>
+            </w:r>
+            <w:proofErr w:type="spellStart"/>
+            <w:r>
+              <w:rPr>
+                <w:rStyle w:val="HTML-kd"/>
+                <w:rFonts w:eastAsiaTheme="minorHAnsi"/>
+              </w:rPr>
+              <w:t>konyvmodositas</w:t>
+            </w:r>
+            <w:proofErr w:type="spellEnd"/>
+          </w:p>
+        </w:tc>
+        <w:tc>
+          <w:tcPr>
+            <w:tcW w:w="678" w:type="dxa"/>
+            <w:vAlign w:val="center"/>
+          </w:tcPr>
+          <w:p>
+            <w:r>
+              <w:t>PUT</w:t>
+            </w:r>
+          </w:p>
+        </w:tc>
+        <w:tc>
+          <w:tcPr>
+            <w:tcW w:w="1823" w:type="dxa"/>
+            <w:vAlign w:val="center"/>
+          </w:tcPr>
+          <w:p>
+            <w:r>
+              <w:t>A kiválasztott könyv adatainak módosítása.</w:t>
+            </w:r>
+          </w:p>
+        </w:tc>
+        <w:tc>
+          <w:tcPr>
+            <w:tcW w:w="1378" w:type="dxa"/>
+            <w:vAlign w:val="center"/>
+          </w:tcPr>
+          <w:p>
+            <w:r>
+              <w:t xml:space="preserve">email, </w:t>
+            </w:r>
+            <w:proofErr w:type="spellStart"/>
+            <w:r>
+              <w:t>token</w:t>
+            </w:r>
+            <w:proofErr w:type="spellEnd"/>
+            <w:r>
+              <w:t xml:space="preserve">, </w:t>
+            </w:r>
+            <w:proofErr w:type="spellStart"/>
+            <w:r>
+              <w:t>szerzo_ids</w:t>
+            </w:r>
+            <w:proofErr w:type="spellEnd"/>
+            <w:r>
+              <w:t xml:space="preserve">, </w:t>
+            </w:r>
+            <w:proofErr w:type="spellStart"/>
+            <w:r>
+              <w:t>illusztrator_ids</w:t>
+            </w:r>
+            <w:proofErr w:type="spellEnd"/>
+            <w:r>
+              <w:t xml:space="preserve">, </w:t>
+            </w:r>
+            <w:proofErr w:type="spellStart"/>
+            <w:r>
+              <w:t>fordito_ids</w:t>
+            </w:r>
+            <w:proofErr w:type="spellEnd"/>
+            <w:r>
+              <w:t>, adatok[], REGIISBN</w:t>
+            </w:r>
+          </w:p>
+        </w:tc>
+        <w:tc>
+          <w:tcPr>
+            <w:tcW w:w="1792" w:type="dxa"/>
+            <w:vAlign w:val="center"/>
+          </w:tcPr>
+          <w:p>
+            <w:r>
+              <w:t xml:space="preserve">A kiválasztott </w:t>
+            </w:r>
+            <w:r>
+              <w:t>könyv adatait változtatja az alapján amit megkap.(REGIISBN alapján azonosít)</w:t>
+            </w:r>
+          </w:p>
+        </w:tc>
+        <w:bookmarkStart w:id="1" w:name="_GoBack"/>
+        <w:bookmarkEnd w:id="1"/>
+      </w:tr>
+      <w:tr>
+        <w:trPr>
+          <w:tblCellSpacing w:w="15" w:type="dxa"/>
+        </w:trPr>
+        <w:tc>
+          <w:tcPr>
+            <w:tcW w:w="3211" w:type="dxa"/>
+            <w:vAlign w:val="center"/>
+          </w:tcPr>
+          <w:p>
+            <w:pPr>
+              <w:rPr>
+                <w:rStyle w:val="HTML-kd"/>
+                <w:rFonts w:eastAsiaTheme="minorHAnsi"/>
+              </w:rPr>
+            </w:pPr>
+            <w:r>
+              <w:rPr>
+                <w:rStyle w:val="HTML-kd"/>
+                <w:rFonts w:eastAsiaTheme="minorHAnsi"/>
+              </w:rPr>
+              <w:t>/</w:t>
+            </w:r>
+            <w:proofErr w:type="spellStart"/>
+            <w:r>
+              <w:rPr>
+                <w:rStyle w:val="HTML-kd"/>
+                <w:rFonts w:eastAsiaTheme="minorHAnsi"/>
+              </w:rPr>
+              <w:t>konyvek</w:t>
+            </w:r>
+            <w:proofErr w:type="spellEnd"/>
+            <w:r>
+              <w:rPr>
+                <w:rStyle w:val="HTML-kd"/>
+                <w:rFonts w:eastAsiaTheme="minorHAnsi"/>
+              </w:rPr>
+              <w:t>/</w:t>
+            </w:r>
+            <w:proofErr w:type="spellStart"/>
+            <w:r>
+              <w:rPr>
+                <w:rStyle w:val="HTML-kd"/>
+                <w:rFonts w:eastAsiaTheme="minorHAnsi"/>
+              </w:rPr>
+              <w:t>konyvtorol</w:t>
+            </w:r>
+            <w:proofErr w:type="spellEnd"/>
+          </w:p>
+        </w:tc>
+        <w:tc>
+          <w:tcPr>
+            <w:tcW w:w="678" w:type="dxa"/>
+            <w:vAlign w:val="center"/>
+          </w:tcPr>
+          <w:p>
+            <w:r>
+              <w:t>DELETE</w:t>
+            </w:r>
+          </w:p>
+        </w:tc>
+        <w:tc>
+          <w:tcPr>
+            <w:tcW w:w="1823" w:type="dxa"/>
+            <w:vAlign w:val="center"/>
+          </w:tcPr>
+          <w:p>
+            <w:r>
+              <w:t xml:space="preserve">A kiválasztott </w:t>
+            </w:r>
+            <w:r>
+              <w:t>könyv törlése.</w:t>
+            </w:r>
+          </w:p>
+        </w:tc>
+        <w:tc>
+          <w:tcPr>
+            <w:tcW w:w="1378" w:type="dxa"/>
+            <w:vAlign w:val="center"/>
+          </w:tcPr>
+          <w:p>
+            <w:r>
+              <w:t xml:space="preserve">email, </w:t>
+            </w:r>
+            <w:proofErr w:type="spellStart"/>
+            <w:r>
+              <w:t>token</w:t>
+            </w:r>
+            <w:proofErr w:type="spellEnd"/>
+            <w:r>
+              <w:t xml:space="preserve">, </w:t>
+            </w:r>
+            <w:r>
+              <w:t>ISBN</w:t>
+            </w:r>
+          </w:p>
+        </w:tc>
+        <w:tc>
+          <w:tcPr>
+            <w:tcW w:w="1792" w:type="dxa"/>
+            <w:vAlign w:val="center"/>
+          </w:tcPr>
+          <w:p>
+            <w:r>
+              <w:t xml:space="preserve">A kiválasztott </w:t>
+            </w:r>
+            <w:r>
+              <w:t>könyv törlése.</w:t>
+            </w:r>
+            <w:r>
+              <w:t xml:space="preserve"> </w:t>
+            </w:r>
+          </w:p>
+        </w:tc>
+      </w:tr>
+    </w:tbl>
     <w:p>
       <w:pPr>
         <w:rPr>
@@ -6303,49 +7807,6 @@
         <w:rPr>
           <w:noProof/>
         </w:rPr>
-        <w:br/>
-      </w:r>
-      <w:r>
-        <w:rPr>
-          <w:noProof/>
-        </w:rPr>
-        <w:br/>
-      </w:r>
-      <w:r>
-        <w:rPr>
-          <w:noProof/>
-        </w:rPr>
-        <w:br/>
-      </w:r>
-      <w:r>
-        <w:rPr>
-          <w:noProof/>
-        </w:rPr>
-        <w:br/>
-      </w:r>
-      <w:r>
-        <w:rPr>
-          <w:noProof/>
-        </w:rPr>
-        <w:br/>
-      </w:r>
-      <w:r>
-        <w:rPr>
-          <w:noProof/>
-        </w:rPr>
-        <w:br/>
-      </w:r>
-      <w:r>
-        <w:rPr>
-          <w:noProof/>
-        </w:rPr>
-        <w:br/>
-      </w:r>
-      <w:r>
-        <w:rPr>
-          <w:noProof/>
-        </w:rPr>
-        <w:lastRenderedPageBreak/>
         <w:br/>
       </w:r>
       <w:r>
@@ -7258,6 +8719,7 @@
     <w:lsdException w:name="HTML Sample" w:semiHidden="1" w:unhideWhenUsed="1"/>
     <w:lsdException w:name="HTML Typewriter" w:semiHidden="1" w:unhideWhenUsed="1"/>
     <w:lsdException w:name="HTML Variable" w:semiHidden="1" w:unhideWhenUsed="1"/>
+    <w:lsdException w:name="Normal Table" w:semiHidden="1" w:unhideWhenUsed="1"/>
     <w:lsdException w:name="annotation subject" w:semiHidden="1" w:unhideWhenUsed="1"/>
     <w:lsdException w:name="No List" w:semiHidden="1" w:unhideWhenUsed="1"/>
     <w:lsdException w:name="Outline List 1" w:semiHidden="1" w:unhideWhenUsed="1"/>
@@ -7301,8 +8763,10 @@
     <w:lsdException w:name="Table Elegant" w:semiHidden="1" w:unhideWhenUsed="1"/>
     <w:lsdException w:name="Table Professional" w:semiHidden="1" w:unhideWhenUsed="1"/>
     <w:lsdException w:name="Table Subtle 1" w:semiHidden="1" w:unhideWhenUsed="1"/>
+    <w:lsdException w:name="Table Subtle 2" w:semiHidden="1" w:unhideWhenUsed="1"/>
     <w:lsdException w:name="Table Web 1" w:semiHidden="1" w:unhideWhenUsed="1"/>
     <w:lsdException w:name="Table Web 2" w:semiHidden="1" w:unhideWhenUsed="1"/>
+    <w:lsdException w:name="Table Web 3" w:semiHidden="1" w:unhideWhenUsed="1"/>
     <w:lsdException w:name="Balloon Text" w:semiHidden="1" w:unhideWhenUsed="1"/>
     <w:lsdException w:name="Table Grid" w:uiPriority="39"/>
     <w:lsdException w:name="Table Theme" w:semiHidden="1" w:unhideWhenUsed="1"/>

</xml_diff>

<commit_message>
Admin kis adatok törlése + pop up a kosárba helyezésnél
</commit_message>
<xml_diff>
--- a/backend/Projekt feladat.docx
+++ b/backend/Projekt feladat.docx
@@ -42,20 +42,6 @@
         </w:rPr>
         <w:t xml:space="preserve">A projektünkben egy könyves boltot hoztunk létre. Egy valós webáruház alapján készítettünk el. Az adatbázisunk táblái és kapcsolatai a következők: </w:t>
       </w:r>
-    </w:p>
-    <w:p>
-      <w:pPr>
-        <w:pStyle w:val="Cmsor1"/>
-        <w:rPr>
-          <w:rFonts w:cs="Times New Roman"/>
-        </w:rPr>
-      </w:pPr>
-      <w:r>
-        <w:rPr>
-          <w:rFonts w:cs="Times New Roman"/>
-        </w:rPr>
-        <w:t xml:space="preserve">Adatbázis: </w:t>
-      </w:r>
       <w:bookmarkStart w:id="0" w:name="_GoBack"/>
       <w:bookmarkEnd w:id="0"/>
     </w:p>
@@ -63,35 +49,51 @@
       <w:pPr>
         <w:rPr>
           <w:rFonts w:ascii="Times New Roman" w:hAnsi="Times New Roman" w:cs="Times New Roman"/>
-          <w:noProof/>
         </w:rPr>
+        <w:sectPr>
+          <w:pgSz w:w="11906" w:h="16838"/>
+          <w:pgMar w:top="1417" w:right="1417" w:bottom="1417" w:left="1417" w:header="708" w:footer="708" w:gutter="0"/>
+          <w:cols w:space="708"/>
+          <w:docGrid w:linePitch="360"/>
+        </w:sectPr>
       </w:pPr>
       <w:r>
         <w:rPr>
           <w:rFonts w:ascii="Times New Roman" w:hAnsi="Times New Roman" w:cs="Times New Roman"/>
-          <w:noProof/>
         </w:rPr>
-        <w:t xml:space="preserve"> </w:t>
+        <w:br w:type="page"/>
       </w:r>
+    </w:p>
+    <w:p>
+      <w:pPr>
+        <w:rPr>
+          <w:rFonts w:ascii="Times New Roman" w:hAnsi="Times New Roman" w:cs="Times New Roman"/>
+        </w:rPr>
+        <w:sectPr>
+          <w:pgSz w:w="16838" w:h="11906" w:orient="landscape"/>
+          <w:pgMar w:top="1417" w:right="1417" w:bottom="1417" w:left="1417" w:header="708" w:footer="708" w:gutter="0"/>
+          <w:cols w:space="708"/>
+          <w:docGrid w:linePitch="360"/>
+        </w:sectPr>
+      </w:pPr>
       <w:r>
         <w:rPr>
           <w:rFonts w:ascii="Times New Roman" w:hAnsi="Times New Roman" w:cs="Times New Roman"/>
-          <w:noProof/>
-          <w:lang w:eastAsia="hu-HU"/>
         </w:rPr>
+        <w:lastRenderedPageBreak/>
         <w:drawing>
-          <wp:anchor distT="0" distB="0" distL="114300" distR="114300" simplePos="0" relativeHeight="251658240" behindDoc="1" locked="0" layoutInCell="1" allowOverlap="1" wp14:anchorId="1E0FCE13">
+          <wp:anchor distT="0" distB="0" distL="114300" distR="114300" simplePos="0" relativeHeight="251662336" behindDoc="0" locked="0" layoutInCell="1" allowOverlap="1" wp14:anchorId="3D44FDA9">
             <wp:simplePos x="0" y="0"/>
-            <wp:positionH relativeFrom="column">
-              <wp:posOffset>3202416</wp:posOffset>
+            <wp:positionH relativeFrom="margin">
+              <wp:posOffset>4920311</wp:posOffset>
             </wp:positionH>
             <wp:positionV relativeFrom="paragraph">
-              <wp:posOffset>207479</wp:posOffset>
+              <wp:posOffset>2471531</wp:posOffset>
             </wp:positionV>
-            <wp:extent cx="2695575" cy="3620625"/>
-            <wp:effectExtent l="0" t="0" r="0" b="0"/>
+            <wp:extent cx="1988047" cy="4091549"/>
+            <wp:effectExtent l="0" t="0" r="0" b="4445"/>
             <wp:wrapNone/>
-            <wp:docPr id="1" name="Kép 1"/>
+            <wp:docPr id="21" name="Kép 21"/>
             <wp:cNvGraphicFramePr>
               <a:graphicFrameLocks xmlns:a="http://schemas.openxmlformats.org/drawingml/2006/main" noChangeAspect="1"/>
             </wp:cNvGraphicFramePr>
@@ -117,7 +119,7 @@
                   <pic:spPr>
                     <a:xfrm>
                       <a:off x="0" y="0"/>
-                      <a:ext cx="2695575" cy="3620625"/>
+                      <a:ext cx="1988047" cy="4091549"/>
                     </a:xfrm>
                     <a:prstGeom prst="rect">
                       <a:avLst/>
@@ -135,37 +137,23 @@
           </wp:anchor>
         </w:drawing>
       </w:r>
-    </w:p>
-    <w:p>
-      <w:pPr>
-        <w:pStyle w:val="Cmsor2"/>
-        <w:numPr>
-          <w:ilvl w:val="0"/>
-          <w:numId w:val="0"/>
-        </w:numPr>
-        <w:rPr>
-          <w:rFonts w:cs="Times New Roman"/>
-        </w:rPr>
-      </w:pPr>
       <w:r>
         <w:rPr>
-          <w:rFonts w:cs="Times New Roman"/>
-          <w:noProof/>
-          <w:lang w:eastAsia="hu-HU"/>
+          <w:rFonts w:ascii="Times New Roman" w:hAnsi="Times New Roman" w:cs="Times New Roman"/>
         </w:rPr>
         <w:drawing>
-          <wp:anchor distT="0" distB="0" distL="114300" distR="114300" simplePos="0" relativeHeight="251661312" behindDoc="1" locked="0" layoutInCell="1" allowOverlap="1" wp14:anchorId="6F05E83B">
+          <wp:anchor distT="0" distB="0" distL="114300" distR="114300" simplePos="0" relativeHeight="251660288" behindDoc="0" locked="0" layoutInCell="1" allowOverlap="1" wp14:anchorId="04EC45B5">
             <wp:simplePos x="0" y="0"/>
             <wp:positionH relativeFrom="margin">
-              <wp:align>left</wp:align>
+              <wp:posOffset>4768712</wp:posOffset>
             </wp:positionH>
             <wp:positionV relativeFrom="paragraph">
-              <wp:posOffset>3629412</wp:posOffset>
+              <wp:posOffset>-900734</wp:posOffset>
             </wp:positionV>
-            <wp:extent cx="5760720" cy="3640455"/>
-            <wp:effectExtent l="0" t="0" r="0" b="0"/>
+            <wp:extent cx="4770783" cy="4453442"/>
+            <wp:effectExtent l="0" t="0" r="0" b="4445"/>
             <wp:wrapNone/>
-            <wp:docPr id="4" name="Kép 4"/>
+            <wp:docPr id="19" name="Kép 19"/>
             <wp:cNvGraphicFramePr>
               <a:graphicFrameLocks xmlns:a="http://schemas.openxmlformats.org/drawingml/2006/main" noChangeAspect="1"/>
             </wp:cNvGraphicFramePr>
@@ -191,7 +179,7 @@
                   <pic:spPr>
                     <a:xfrm>
                       <a:off x="0" y="0"/>
-                      <a:ext cx="5760720" cy="3640455"/>
+                      <a:ext cx="4770783" cy="4453442"/>
                     </a:xfrm>
                     <a:prstGeom prst="rect">
                       <a:avLst/>
@@ -211,23 +199,21 @@
       </w:r>
       <w:r>
         <w:rPr>
-          <w:rFonts w:cs="Times New Roman"/>
-          <w:noProof/>
-          <w:lang w:eastAsia="hu-HU"/>
+          <w:rFonts w:ascii="Times New Roman" w:hAnsi="Times New Roman" w:cs="Times New Roman"/>
         </w:rPr>
         <w:drawing>
-          <wp:anchor distT="0" distB="0" distL="114300" distR="114300" simplePos="0" relativeHeight="251659264" behindDoc="1" locked="0" layoutInCell="1" allowOverlap="1" wp14:anchorId="02DEFDFA">
+          <wp:anchor distT="0" distB="0" distL="114300" distR="114300" simplePos="0" relativeHeight="251659264" behindDoc="0" locked="0" layoutInCell="1" allowOverlap="1" wp14:anchorId="47C8FEA7">
             <wp:simplePos x="0" y="0"/>
-            <wp:positionH relativeFrom="margin">
-              <wp:posOffset>110546</wp:posOffset>
+            <wp:positionH relativeFrom="page">
+              <wp:posOffset>-15903</wp:posOffset>
             </wp:positionH>
             <wp:positionV relativeFrom="paragraph">
-              <wp:posOffset>33765</wp:posOffset>
+              <wp:posOffset>-868294</wp:posOffset>
             </wp:positionV>
-            <wp:extent cx="3114205" cy="2488412"/>
-            <wp:effectExtent l="0" t="0" r="0" b="7620"/>
+            <wp:extent cx="5732343" cy="4063116"/>
+            <wp:effectExtent l="0" t="0" r="1905" b="0"/>
             <wp:wrapNone/>
-            <wp:docPr id="2" name="Kép 2"/>
+            <wp:docPr id="1" name="Kép 1"/>
             <wp:cNvGraphicFramePr>
               <a:graphicFrameLocks xmlns:a="http://schemas.openxmlformats.org/drawingml/2006/main" noChangeAspect="1"/>
             </wp:cNvGraphicFramePr>
@@ -253,7 +239,7 @@
                   <pic:spPr>
                     <a:xfrm>
                       <a:off x="0" y="0"/>
-                      <a:ext cx="3114205" cy="2488412"/>
+                      <a:ext cx="5732343" cy="4063116"/>
                     </a:xfrm>
                     <a:prstGeom prst="rect">
                       <a:avLst/>
@@ -271,37 +257,45 @@
           </wp:anchor>
         </w:drawing>
       </w:r>
-      <w:r>
+    </w:p>
+    <w:p>
+      <w:pPr>
+        <w:rPr>
+          <w:rFonts w:ascii="Times New Roman" w:hAnsi="Times New Roman" w:cs="Times New Roman"/>
+        </w:rPr>
+      </w:pPr>
+    </w:p>
+    <w:p>
+      <w:pPr>
+        <w:pStyle w:val="Cmsor1"/>
         <w:rPr>
           <w:rFonts w:cs="Times New Roman"/>
-          <w:noProof/>
         </w:rPr>
-        <w:br w:type="page"/>
-      </w:r>
-      <w:r>
-        <w:rPr>
-          <w:rFonts w:cs="Times New Roman"/>
-          <w:noProof/>
-        </w:rPr>
-        <w:lastRenderedPageBreak/>
-        <w:br/>
-      </w:r>
+      </w:pPr>
       <w:r>
         <w:rPr>
           <w:rFonts w:cs="Times New Roman"/>
         </w:rPr>
-        <w:t>1.1. Borító tábla:</w:t>
+        <w:t xml:space="preserve">Adatbázis: </w:t>
+      </w:r>
+    </w:p>
+    <w:p>
+      <w:pPr>
+        <w:pStyle w:val="Cmsor2"/>
+        <w:rPr>
+          <w:noProof/>
+        </w:rPr>
+      </w:pPr>
+      <w:r>
+        <w:rPr>
+          <w:noProof/>
+        </w:rPr>
+        <w:t>Borító tábla</w:t>
       </w:r>
       <w:r>
-        <w:rPr>
-          <w:rFonts w:cs="Times New Roman"/>
-        </w:rPr>
         <w:br/>
       </w:r>
       <w:r>
-        <w:rPr>
-          <w:rFonts w:cs="Times New Roman"/>
-        </w:rPr>
         <w:t xml:space="preserve"> </w:t>
       </w:r>
     </w:p>
@@ -1303,7 +1297,6 @@
         <w:rPr>
           <w:rFonts w:cs="Times New Roman"/>
         </w:rPr>
-        <w:lastRenderedPageBreak/>
         <w:t>Illusztráció:</w:t>
       </w:r>
     </w:p>
@@ -2056,6 +2049,26 @@
     </w:p>
     <w:p>
       <w:pPr>
+        <w:rPr>
+          <w:rFonts w:ascii="Times New Roman" w:hAnsi="Times New Roman" w:cs="Times New Roman"/>
+        </w:rPr>
+      </w:pPr>
+      <w:r>
+        <w:rPr>
+          <w:rFonts w:ascii="Times New Roman" w:hAnsi="Times New Roman" w:cs="Times New Roman"/>
+        </w:rPr>
+        <w:br w:type="page"/>
+      </w:r>
+    </w:p>
+    <w:p>
+      <w:pPr>
+        <w:rPr>
+          <w:rFonts w:ascii="Times New Roman" w:hAnsi="Times New Roman" w:cs="Times New Roman"/>
+        </w:rPr>
+      </w:pPr>
+    </w:p>
+    <w:p>
+      <w:pPr>
         <w:pStyle w:val="Cmsor2"/>
         <w:rPr>
           <w:rFonts w:cs="Times New Roman"/>
@@ -2772,31 +2785,7 @@
               <w:rPr>
                 <w:rFonts w:ascii="Times New Roman" w:hAnsi="Times New Roman" w:cs="Times New Roman"/>
               </w:rPr>
-              <w:t xml:space="preserve">Idegen kulcs, a </w:t>
-            </w:r>
-            <w:r>
-              <w:rPr>
-                <w:rFonts w:ascii="Times New Roman" w:hAnsi="Times New Roman" w:cs="Times New Roman"/>
-              </w:rPr>
-              <w:t>termek</w:t>
-            </w:r>
-            <w:r>
-              <w:rPr>
-                <w:rFonts w:ascii="Times New Roman" w:hAnsi="Times New Roman" w:cs="Times New Roman"/>
-              </w:rPr>
-              <w:t xml:space="preserve"> tábla </w:t>
-            </w:r>
-            <w:r>
-              <w:rPr>
-                <w:rFonts w:ascii="Times New Roman" w:hAnsi="Times New Roman" w:cs="Times New Roman"/>
-              </w:rPr>
-              <w:t>ISBN</w:t>
-            </w:r>
-            <w:r>
-              <w:rPr>
-                <w:rFonts w:ascii="Times New Roman" w:hAnsi="Times New Roman" w:cs="Times New Roman"/>
-              </w:rPr>
-              <w:t xml:space="preserve"> mezőjére</w:t>
+              <w:t>Idegen kulcs, a termek tábla ISBN mezőjére</w:t>
             </w:r>
             <w:r>
               <w:rPr>
@@ -2926,15 +2915,29 @@
     </w:tbl>
     <w:p>
       <w:pPr>
-        <w:pStyle w:val="Cmsor2"/>
         <w:rPr>
-          <w:rFonts w:cs="Times New Roman"/>
+          <w:rFonts w:ascii="Times" w:eastAsiaTheme="majorEastAsia" w:hAnsi="Times" w:cs="Times New Roman"/>
+          <w:b/>
+          <w:color w:val="000000" w:themeColor="text1"/>
+          <w:sz w:val="28"/>
+          <w:szCs w:val="26"/>
+          <w:highlight w:val="lightGray"/>
         </w:rPr>
       </w:pPr>
       <w:r>
         <w:rPr>
-          <w:rFonts w:cs="Times New Roman"/>
+          <w:rFonts w:ascii="Times" w:hAnsi="Times" w:cs="Times New Roman"/>
+          <w:highlight w:val="lightGray"/>
         </w:rPr>
+        <w:br w:type="page"/>
+      </w:r>
+    </w:p>
+    <w:p>
+      <w:pPr>
+        <w:pStyle w:val="Cmsor2"/>
+      </w:pPr>
+      <w:r>
+        <w:lastRenderedPageBreak/>
         <w:t>Kapcsoló Szerző</w:t>
       </w:r>
     </w:p>
@@ -3197,37 +3200,7 @@
               <w:rPr>
                 <w:rFonts w:ascii="Times New Roman" w:hAnsi="Times New Roman" w:cs="Times New Roman"/>
               </w:rPr>
-              <w:t xml:space="preserve">Idegen kulcs, a </w:t>
-            </w:r>
-            <w:r>
-              <w:rPr>
-                <w:rFonts w:ascii="Times New Roman" w:hAnsi="Times New Roman" w:cs="Times New Roman"/>
-              </w:rPr>
-              <w:t>termek</w:t>
-            </w:r>
-            <w:r>
-              <w:rPr>
-                <w:rFonts w:ascii="Times New Roman" w:hAnsi="Times New Roman" w:cs="Times New Roman"/>
-              </w:rPr>
-              <w:t xml:space="preserve"> tábla </w:t>
-            </w:r>
-            <w:r>
-              <w:rPr>
-                <w:rFonts w:ascii="Times New Roman" w:hAnsi="Times New Roman" w:cs="Times New Roman"/>
-              </w:rPr>
-              <w:t>ISBN</w:t>
-            </w:r>
-            <w:r>
-              <w:rPr>
-                <w:rFonts w:ascii="Times New Roman" w:hAnsi="Times New Roman" w:cs="Times New Roman"/>
-              </w:rPr>
-              <w:t xml:space="preserve"> mezőjére</w:t>
-            </w:r>
-            <w:r>
-              <w:rPr>
-                <w:rFonts w:ascii="Times New Roman" w:hAnsi="Times New Roman" w:cs="Times New Roman"/>
-              </w:rPr>
-              <w:t>.</w:t>
+              <w:t>Idegen kulcs, a termek tábla ISBN mezőjére.</w:t>
             </w:r>
             <w:r>
               <w:rPr>
@@ -3295,19 +3268,7 @@
               <w:rPr>
                 <w:rFonts w:ascii="Times New Roman" w:hAnsi="Times New Roman" w:cs="Times New Roman"/>
               </w:rPr>
-              <w:t xml:space="preserve">Idegen kulcs, a </w:t>
-            </w:r>
-            <w:r>
-              <w:rPr>
-                <w:rFonts w:ascii="Times New Roman" w:hAnsi="Times New Roman" w:cs="Times New Roman"/>
-              </w:rPr>
-              <w:t>szerző</w:t>
-            </w:r>
-            <w:r>
-              <w:rPr>
-                <w:rFonts w:ascii="Times New Roman" w:hAnsi="Times New Roman" w:cs="Times New Roman"/>
-              </w:rPr>
-              <w:t xml:space="preserve"> tábla </w:t>
+              <w:t xml:space="preserve">Idegen kulcs, a szerző tábla </w:t>
             </w:r>
             <w:proofErr w:type="spellStart"/>
             <w:r>
@@ -3375,29 +3336,9 @@
     </w:tbl>
     <w:p>
       <w:pPr>
-        <w:rPr>
-          <w:rFonts w:ascii="Times New Roman" w:hAnsi="Times New Roman" w:cs="Times New Roman"/>
-        </w:rPr>
+        <w:pStyle w:val="Cmsor2"/>
       </w:pPr>
       <w:r>
-        <w:rPr>
-          <w:rFonts w:ascii="Times New Roman" w:hAnsi="Times New Roman" w:cs="Times New Roman"/>
-        </w:rPr>
-        <w:br w:type="page"/>
-      </w:r>
-    </w:p>
-    <w:p>
-      <w:pPr>
-        <w:pStyle w:val="Cmsor2"/>
-        <w:rPr>
-          <w:rFonts w:cs="Times New Roman"/>
-        </w:rPr>
-      </w:pPr>
-      <w:r>
-        <w:rPr>
-          <w:rFonts w:cs="Times New Roman"/>
-        </w:rPr>
-        <w:lastRenderedPageBreak/>
         <w:t xml:space="preserve"> Kapcsoló illusztrátor</w:t>
       </w:r>
     </w:p>
@@ -3667,31 +3608,7 @@
               <w:rPr>
                 <w:rFonts w:ascii="Times New Roman" w:hAnsi="Times New Roman" w:cs="Times New Roman"/>
               </w:rPr>
-              <w:t xml:space="preserve">Idegen kulcs, a </w:t>
-            </w:r>
-            <w:r>
-              <w:rPr>
-                <w:rFonts w:ascii="Times New Roman" w:hAnsi="Times New Roman" w:cs="Times New Roman"/>
-              </w:rPr>
-              <w:t>termek</w:t>
-            </w:r>
-            <w:r>
-              <w:rPr>
-                <w:rFonts w:ascii="Times New Roman" w:hAnsi="Times New Roman" w:cs="Times New Roman"/>
-              </w:rPr>
-              <w:t xml:space="preserve"> tábla </w:t>
-            </w:r>
-            <w:r>
-              <w:rPr>
-                <w:rFonts w:ascii="Times New Roman" w:hAnsi="Times New Roman" w:cs="Times New Roman"/>
-              </w:rPr>
-              <w:t>ISBN</w:t>
-            </w:r>
-            <w:r>
-              <w:rPr>
-                <w:rFonts w:ascii="Times New Roman" w:hAnsi="Times New Roman" w:cs="Times New Roman"/>
-              </w:rPr>
-              <w:t xml:space="preserve"> mezőjére</w:t>
+              <w:t>Idegen kulcs, a termek tábla ISBN mezőjére</w:t>
             </w:r>
             <w:r>
               <w:rPr>
@@ -3783,19 +3700,7 @@
               <w:rPr>
                 <w:rFonts w:ascii="Times New Roman" w:hAnsi="Times New Roman" w:cs="Times New Roman"/>
               </w:rPr>
-              <w:t>Idegen kulcs, a</w:t>
-            </w:r>
-            <w:r>
-              <w:rPr>
-                <w:rFonts w:ascii="Times New Roman" w:hAnsi="Times New Roman" w:cs="Times New Roman"/>
-              </w:rPr>
-              <w:t>z</w:t>
-            </w:r>
-            <w:r>
-              <w:rPr>
-                <w:rFonts w:ascii="Times New Roman" w:hAnsi="Times New Roman" w:cs="Times New Roman"/>
-              </w:rPr>
-              <w:t xml:space="preserve"> </w:t>
+              <w:t xml:space="preserve">Idegen kulcs, az </w:t>
             </w:r>
             <w:proofErr w:type="spellStart"/>
             <w:r>
@@ -3809,13 +3714,7 @@
               <w:rPr>
                 <w:rFonts w:ascii="Times New Roman" w:hAnsi="Times New Roman" w:cs="Times New Roman"/>
               </w:rPr>
-              <w:t xml:space="preserve"> </w:t>
-            </w:r>
-            <w:r>
-              <w:rPr>
-                <w:rFonts w:ascii="Times New Roman" w:hAnsi="Times New Roman" w:cs="Times New Roman"/>
-              </w:rPr>
-              <w:t xml:space="preserve">tábla </w:t>
+              <w:t xml:space="preserve"> tábla </w:t>
             </w:r>
             <w:proofErr w:type="spellStart"/>
             <w:r>
@@ -3885,6 +3784,26 @@
         </w:tc>
       </w:tr>
     </w:tbl>
+    <w:p>
+      <w:pPr>
+        <w:rPr>
+          <w:rFonts w:ascii="Times New Roman" w:hAnsi="Times New Roman" w:cs="Times New Roman"/>
+        </w:rPr>
+      </w:pPr>
+    </w:p>
+    <w:p>
+      <w:pPr>
+        <w:rPr>
+          <w:rFonts w:ascii="Times New Roman" w:hAnsi="Times New Roman" w:cs="Times New Roman"/>
+        </w:rPr>
+      </w:pPr>
+      <w:r>
+        <w:rPr>
+          <w:rFonts w:ascii="Times New Roman" w:hAnsi="Times New Roman" w:cs="Times New Roman"/>
+        </w:rPr>
+        <w:br w:type="page"/>
+      </w:r>
+    </w:p>
     <w:p>
       <w:pPr>
         <w:rPr>
@@ -3903,7 +3822,7 @@
         <w:rPr>
           <w:rFonts w:cs="Times New Roman"/>
         </w:rPr>
-        <w:t xml:space="preserve"> Termék</w:t>
+        <w:t>Termék</w:t>
       </w:r>
     </w:p>
     <w:tbl>
@@ -3941,17 +3860,8 @@
                 <w:rFonts w:ascii="Times New Roman" w:hAnsi="Times New Roman" w:cs="Times New Roman"/>
                 <w:i/>
               </w:rPr>
-              <w:t xml:space="preserve">Kapcsoló </w:t>
-            </w:r>
-            <w:proofErr w:type="spellStart"/>
-            <w:r>
-              <w:rPr>
-                <w:rFonts w:ascii="Times New Roman" w:hAnsi="Times New Roman" w:cs="Times New Roman"/>
-                <w:i/>
-              </w:rPr>
-              <w:t>illusztrator</w:t>
-            </w:r>
-            <w:proofErr w:type="spellEnd"/>
+              <w:t>Termék</w:t>
+            </w:r>
             <w:r>
               <w:rPr>
                 <w:rFonts w:ascii="Times New Roman" w:hAnsi="Times New Roman" w:cs="Times New Roman"/>
@@ -4211,19 +4121,7 @@
               <w:rPr>
                 <w:rFonts w:ascii="Times New Roman" w:hAnsi="Times New Roman" w:cs="Times New Roman"/>
               </w:rPr>
-              <w:t xml:space="preserve">Idegen kulcs, a </w:t>
-            </w:r>
-            <w:r>
-              <w:rPr>
-                <w:rFonts w:ascii="Times New Roman" w:hAnsi="Times New Roman" w:cs="Times New Roman"/>
-              </w:rPr>
-              <w:t>nyelv</w:t>
-            </w:r>
-            <w:r>
-              <w:rPr>
-                <w:rFonts w:ascii="Times New Roman" w:hAnsi="Times New Roman" w:cs="Times New Roman"/>
-              </w:rPr>
-              <w:t xml:space="preserve"> tábla </w:t>
+              <w:t xml:space="preserve">Idegen kulcs, a nyelv tábla </w:t>
             </w:r>
             <w:proofErr w:type="spellStart"/>
             <w:r>
@@ -4577,13 +4475,7 @@
               <w:rPr>
                 <w:rFonts w:ascii="Times New Roman" w:hAnsi="Times New Roman" w:cs="Times New Roman"/>
               </w:rPr>
-              <w:t xml:space="preserve"> </w:t>
-            </w:r>
-            <w:r>
-              <w:rPr>
-                <w:rFonts w:ascii="Times New Roman" w:hAnsi="Times New Roman" w:cs="Times New Roman"/>
-              </w:rPr>
-              <w:t xml:space="preserve">Idegen kulcs, a </w:t>
+              <w:t xml:space="preserve"> Idegen kulcs, a </w:t>
             </w:r>
             <w:proofErr w:type="spellStart"/>
             <w:r>
@@ -4635,6 +4527,26 @@
         </w:tc>
       </w:tr>
     </w:tbl>
+    <w:p>
+      <w:pPr>
+        <w:rPr>
+          <w:rFonts w:ascii="Times New Roman" w:hAnsi="Times New Roman" w:cs="Times New Roman"/>
+        </w:rPr>
+      </w:pPr>
+    </w:p>
+    <w:p>
+      <w:pPr>
+        <w:rPr>
+          <w:rFonts w:ascii="Times New Roman" w:hAnsi="Times New Roman" w:cs="Times New Roman"/>
+        </w:rPr>
+      </w:pPr>
+      <w:r>
+        <w:rPr>
+          <w:rFonts w:ascii="Times New Roman" w:hAnsi="Times New Roman" w:cs="Times New Roman"/>
+        </w:rPr>
+        <w:br w:type="page"/>
+      </w:r>
+    </w:p>
     <w:p>
       <w:pPr>
         <w:rPr>
@@ -4653,7 +4565,6 @@
         <w:rPr>
           <w:rFonts w:cs="Times New Roman"/>
         </w:rPr>
-        <w:lastRenderedPageBreak/>
         <w:t>Számla:</w:t>
       </w:r>
     </w:p>
@@ -4732,6 +4643,7 @@
             <w:r>
               <w:rPr>
                 <w:rFonts w:ascii="Times New Roman" w:hAnsi="Times New Roman" w:cs="Times New Roman"/>
+                <w:noProof/>
               </w:rPr>
               <w:drawing>
                 <wp:inline distT="0" distB="0" distL="0" distR="0" wp14:anchorId="1FDCCF62" wp14:editId="01EE6C06">
@@ -5225,13 +5137,7 @@
               <w:rPr>
                 <w:rFonts w:ascii="Times New Roman" w:hAnsi="Times New Roman" w:cs="Times New Roman"/>
               </w:rPr>
-              <w:t xml:space="preserve"> mezőjére</w:t>
-            </w:r>
-            <w:r>
-              <w:rPr>
-                <w:rFonts w:ascii="Times New Roman" w:hAnsi="Times New Roman" w:cs="Times New Roman"/>
-              </w:rPr>
-              <w:t>.</w:t>
+              <w:t xml:space="preserve"> mezőjére.</w:t>
             </w:r>
             <w:r>
               <w:rPr>
@@ -6886,26 +6792,14 @@
               <w:rPr>
                 <w:rFonts w:ascii="Times New Roman" w:hAnsi="Times New Roman" w:cs="Times New Roman"/>
               </w:rPr>
-              <w:t>szamla_</w:t>
-            </w:r>
-            <w:r>
-              <w:rPr>
-                <w:rFonts w:ascii="Times New Roman" w:hAnsi="Times New Roman" w:cs="Times New Roman"/>
-              </w:rPr>
-              <w:t>id</w:t>
-            </w:r>
-            <w:proofErr w:type="spellEnd"/>
-            <w:r>
-              <w:rPr>
-                <w:rFonts w:ascii="Times New Roman" w:hAnsi="Times New Roman" w:cs="Times New Roman"/>
-              </w:rPr>
-              <w:t xml:space="preserve"> mezőjére</w:t>
-            </w:r>
-            <w:r>
-              <w:rPr>
-                <w:rFonts w:ascii="Times New Roman" w:hAnsi="Times New Roman" w:cs="Times New Roman"/>
-              </w:rPr>
-              <w:t xml:space="preserve">. </w:t>
+              <w:t>szamla_id</w:t>
+            </w:r>
+            <w:proofErr w:type="spellEnd"/>
+            <w:r>
+              <w:rPr>
+                <w:rFonts w:ascii="Times New Roman" w:hAnsi="Times New Roman" w:cs="Times New Roman"/>
+              </w:rPr>
+              <w:t xml:space="preserve"> mezőjére. </w:t>
             </w:r>
             <w:r>
               <w:rPr>
@@ -13927,7 +13821,7 @@
 </file>
 
 <file path=customXml/itemProps1.xml><?xml version="1.0" encoding="utf-8"?>
-<ds:datastoreItem xmlns:ds="http://schemas.openxmlformats.org/officeDocument/2006/customXml" ds:itemID="{66E7B51F-38FC-4EB0-AE04-6042F8D08358}">
+<ds:datastoreItem xmlns:ds="http://schemas.openxmlformats.org/officeDocument/2006/customXml" ds:itemID="{74DE13F4-2F71-484B-B571-C7A9E25F5327}">
   <ds:schemaRefs>
     <ds:schemaRef ds:uri="http://schemas.openxmlformats.org/officeDocument/2006/bibliography"/>
   </ds:schemaRefs>

</xml_diff>